<commit_message>
feat: Beyond Borders webinar registration system
- Public registration page (#webinar) with:
  - Corrected time: 11:00 AM EDT | 5:00 PM Spain (CEST)
  - Multi-timezone grid: PDT / MDT / CDT / EDT / ADT / CEST
  - Live countdown timer
  - Full form: name, phone, email, agency, country/state, how heard, referrer, GDPR
  - Benefits section with 6 value cards + urgency CTA bar
  - Animated success panel

- Admin dashboard (#admin/webinar):
  - Sidebar link + registrations table with all fields
  - Export to Excel (CSV with UTF-8 BOM)
  - Registration counter stat card

- Backend:
  - saveWebinarRegistration() + getWebinarRegistrations() in auth-service.js
  - Firestore collection: webinar_registrations (demo mode compatible)
  - Routing: webinar (public) + admin/webinar (admin-only) in router.js
</commit_message>
<xml_diff>
--- a/USA - Spain /Presentación B2B/Guion_Webinario_Beyond_Borders.docx
+++ b/USA - Spain /Presentación B2B/Guion_Webinario_Beyond_Borders.docx
@@ -55,7 +55,7 @@
           <w:color w:val="808080"/>
           <w:sz w:val="20"/>
         </w:rPr>
-        <w:t>Duración total: 50–55 minutos | Formato: Bilingüe Inglés / Español</w:t>
+        <w:t>Duración total: 48–52 minutos | Formato: Bilingüe Inglés / Español</w:t>
       </w:r>
     </w:p>
     <w:p>
@@ -234,7 +234,7 @@
                 <w:color w:val="000000"/>
                 <w:sz w:val="19"/>
               </w:rPr>
-              <w:t>50 – 55 minutos + Q&amp;A</w:t>
+              <w:t>48 – 52 minutos + Q&amp;A</w:t>
             </w:r>
           </w:p>
         </w:tc>
@@ -331,7 +331,7 @@
                 <w:color w:val="000000"/>
                 <w:sz w:val="19"/>
               </w:rPr>
-              <w:t>Fuster &amp; Associates (Legal) · UCI (Financiación) · Inmomás Holidays (Rentas) · Smbiotica (Marketing)</w:t>
+              <w:t>Fuster &amp; Associates (Legal) · UCI (Financiación) · Inmomás Holidays (Rentas vacionales)</w:t>
             </w:r>
           </w:p>
         </w:tc>
@@ -395,7 +395,7 @@
                 <w:color w:val="000000"/>
                 <w:sz w:val="19"/>
               </w:rPr>
-              <w:t>Presentación de 16 diapositivas (PowerPoint / Canva)</w:t>
+              <w:t>Presentación de 15 diapositivas (PowerPoint / Canva)</w:t>
             </w:r>
           </w:p>
         </w:tc>
@@ -696,7 +696,7 @@
                 <w:color w:val="000000"/>
                 <w:sz w:val="19"/>
               </w:rPr>
-              <w:t>20:00 – 35:00</w:t>
+              <w:t>20:00 – 32:00</w:t>
             </w:r>
           </w:p>
         </w:tc>
@@ -764,7 +764,7 @@
                 <w:color w:val="000000"/>
                 <w:sz w:val="19"/>
               </w:rPr>
-              <w:t>35:00 – 43:00</w:t>
+              <w:t>32:00 – 40:00</w:t>
             </w:r>
           </w:p>
         </w:tc>
@@ -830,7 +830,7 @@
                 <w:color w:val="000000"/>
                 <w:sz w:val="19"/>
               </w:rPr>
-              <w:t>43:00 – 55:00</w:t>
+              <w:t>40:00 – 52:00</w:t>
             </w:r>
           </w:p>
         </w:tc>
@@ -930,12 +930,12 @@
           <w:color w:val="444444"/>
           <w:sz w:val="20"/>
         </w:rPr>
-        <w:t>GUIÓN (Agente 1 — voz principal de apertura):</w:t>
+        <w:t>GUIÓN EN INGLÉS (Agente 1 — voz principal de apertura):</w:t>
       </w:r>
     </w:p>
     <w:p>
       <w:pPr>
-        <w:spacing w:before="40" w:after="120"/>
+        <w:spacing w:before="40" w:after="80"/>
         <w:ind w:left="850"/>
       </w:pPr>
       <w:r>
@@ -955,31 +955,50 @@
     </w:p>
     <w:p>
       <w:pPr>
-        <w:spacing w:before="120"/>
-        <w:jc w:val="left"/>
+        <w:spacing w:before="100" w:after="40"/>
+        <w:ind w:left="567"/>
       </w:pPr>
       <w:r>
         <w:rPr>
           <w:b/>
-          <w:i w:val="0"/>
           <w:color w:val="2266AA"/>
-          <w:sz w:val="20"/>
+          <w:sz w:val="19"/>
         </w:rPr>
-        <w:t>🇪🇸 Versión en español (opcional):</w:t>
+        <w:t>🇪🇸  Versión en español:</w:t>
       </w:r>
     </w:p>
     <w:p>
       <w:pPr>
-        <w:spacing w:before="40" w:after="120"/>
+        <w:spacing w:before="40" w:after="40"/>
+        <w:ind w:left="567"/>
+      </w:pPr>
+      <w:r>
+        <w:rPr>
+          <w:b/>
+          <w:color w:val="224488"/>
+          <w:sz w:val="20"/>
+        </w:rPr>
+        <w:t>GUIÓN EN ESPAÑOL (Agente 1 — voz principal de apertura):</w:t>
+      </w:r>
+    </w:p>
+    <w:p>
+      <w:pPr>
+        <w:spacing w:before="40" w:after="160"/>
         <w:ind w:left="850"/>
       </w:pPr>
       <w:r>
         <w:rPr>
           <w:i/>
-          <w:color w:val="000000"/>
+          <w:color w:val="111144"/>
           <w:sz w:val="21"/>
         </w:rPr>
-        <w:t>"Bienvenidos a todos. Soy [Nombre] y, en nombre de todo el equipo de RE/MAX Inmomás International, gracias por estar aquí. Os prometo que esta hora será de las más rentables de vuestra semana."</w:t>
+        <w:t>"¡Hola a todos, y bienvenidos! Me alegra muchísimo que estéis aquí hoy. Mi nombre es [Nombre], y en nombre de todo el equipo de RE/MAX Inmomás International, quiero agradeceros sinceramente que hayáis reservado esta hora en vuestra apretada agenda.</w:t>
+        <w:br/>
+        <w:br/>
+        <w:t>Sé que, como Realtors, vuestro tiempo es vuestro activo más valioso. Así que permitidme haceros una promesa ahora mismo: al final de esta sesión, vais a salir de aquí con una fuente de ingresos completamente nueva que no requiere ninguna licencia adicional, ningún conocimiento de mercado nuevo, y cero horas extra llevando clientes de propiedad en propiedad.</w:t>
+        <w:br/>
+        <w:br/>
+        <w:t>Esto es una conversación entre colegas inmobiliarios. Sin discurso de ventas. Sin jerga corporativa. Solo dos compañeros que han encontrado algo extraordinario — y quieren compartirlo con vosotros."</w:t>
       </w:r>
     </w:p>
     <w:p>
@@ -1021,12 +1040,12 @@
           <w:color w:val="444444"/>
           <w:sz w:val="20"/>
         </w:rPr>
-        <w:t>GUIÓN (Agente 1 — se presenta a sí mismo):</w:t>
+        <w:t>GUIÓN EN INGLÉS (Agente 1 — se presenta):</w:t>
       </w:r>
     </w:p>
     <w:p>
       <w:pPr>
-        <w:spacing w:before="40" w:after="120"/>
+        <w:spacing w:before="40" w:after="80"/>
         <w:ind w:left="850"/>
       </w:pPr>
       <w:r>
@@ -1046,6 +1065,54 @@
     </w:p>
     <w:p>
       <w:pPr>
+        <w:spacing w:before="100" w:after="40"/>
+        <w:ind w:left="567"/>
+      </w:pPr>
+      <w:r>
+        <w:rPr>
+          <w:b/>
+          <w:color w:val="2266AA"/>
+          <w:sz w:val="19"/>
+        </w:rPr>
+        <w:t>🇪🇸  Versión en español:</w:t>
+      </w:r>
+    </w:p>
+    <w:p>
+      <w:pPr>
+        <w:spacing w:before="40" w:after="40"/>
+        <w:ind w:left="567"/>
+      </w:pPr>
+      <w:r>
+        <w:rPr>
+          <w:b/>
+          <w:color w:val="224488"/>
+          <w:sz w:val="20"/>
+        </w:rPr>
+        <w:t>GUIÓN EN ESPAÑOL (Agente 1 — se presenta):</w:t>
+      </w:r>
+    </w:p>
+    <w:p>
+      <w:pPr>
+        <w:spacing w:before="40" w:after="160"/>
+        <w:ind w:left="850"/>
+      </w:pPr>
+      <w:r>
+        <w:rPr>
+          <w:i/>
+          <w:color w:val="111144"/>
+          <w:sz w:val="21"/>
+        </w:rPr>
+        <w:t>"Antes de entrar en los grandes números, dejadme contaros quiénes somos — porque creo que ese es, en realidad, el punto más importante.</w:t>
+        <w:br/>
+        <w:br/>
+        <w:t>Mi nombre es [Nombre completo]. Trabajé [X] años como Realtor con licencia en [California / Florida / Texas / etc.]. He trabajado con compradores, vendedores, inversores — conozco el esfuerzo diario, conozco el papeleo, sé lo que se necesita para cerrar una operación en un mercado competitivo.</w:t>
+        <w:br/>
+        <w:br/>
+        <w:t>Hace tres años, di el salto a España. Y quiero ser honesto con vosotros: no fue un plan de jubilación anticipada, fue la mejor decisión de negocio de mi vida. Hoy me especializo en ayudar a compradores norteamericanos a encontrar su propiedad perfecta en la Costa Blanca — y lo hago bajo la marca RE/MAX, el nombre más reconocido del sector inmobiliario internacional."</w:t>
+      </w:r>
+    </w:p>
+    <w:p>
+      <w:pPr>
         <w:spacing w:before="120" w:after="40"/>
         <w:ind w:left="567"/>
       </w:pPr>
@@ -1055,12 +1122,12 @@
           <w:color w:val="444444"/>
           <w:sz w:val="20"/>
         </w:rPr>
-        <w:t>GUIÓN (Agente 2 — se presenta):</w:t>
+        <w:t>GUIÓN EN INGLÉS (Agente 2 — se presenta):</w:t>
       </w:r>
     </w:p>
     <w:p>
       <w:pPr>
-        <w:spacing w:before="40" w:after="120"/>
+        <w:spacing w:before="40" w:after="80"/>
         <w:ind w:left="850"/>
       </w:pPr>
       <w:r>
@@ -1076,6 +1143,54 @@
         <w:br/>
         <w:br/>
         <w:t>We are not corporate representatives. We are you — Realtors who made the leap. And that's exactly why we can help your clients make it too."</w:t>
+      </w:r>
+    </w:p>
+    <w:p>
+      <w:pPr>
+        <w:spacing w:before="100" w:after="40"/>
+        <w:ind w:left="567"/>
+      </w:pPr>
+      <w:r>
+        <w:rPr>
+          <w:b/>
+          <w:color w:val="2266AA"/>
+          <w:sz w:val="19"/>
+        </w:rPr>
+        <w:t>🇪🇸  Versión en español:</w:t>
+      </w:r>
+    </w:p>
+    <w:p>
+      <w:pPr>
+        <w:spacing w:before="40" w:after="40"/>
+        <w:ind w:left="567"/>
+      </w:pPr>
+      <w:r>
+        <w:rPr>
+          <w:b/>
+          <w:color w:val="224488"/>
+          <w:sz w:val="20"/>
+        </w:rPr>
+        <w:t>GUIÓN EN ESPAÑOL (Agente 2 — se presenta):</w:t>
+      </w:r>
+    </w:p>
+    <w:p>
+      <w:pPr>
+        <w:spacing w:before="40" w:after="160"/>
+        <w:ind w:left="850"/>
+      </w:pPr>
+      <w:r>
+        <w:rPr>
+          <w:i/>
+          <w:color w:val="111144"/>
+          <w:sz w:val="21"/>
+        </w:rPr>
+        <w:t>"Y yo soy [Nombre completo]. Fui Broker Associate en [Toronto / Vancouver / Montreal] durante [X] años. Mis clientes eran compradores de alto poder adquisitivo que sabían exactamente lo que querían. Lo que finalmente me impulsó a dar el paso a España fue una combinación del coste de vida, el estilo de vida y — siendo completamente honesto — esos inviernos canadienses que no tienen fin.</w:t>
+        <w:br/>
+        <w:br/>
+        <w:t>Hoy, mi pareja y yo vivimos en [Alicante / Valencia / Murcia], nuestros hijos van a un colegio internacional, y dedico mis horas de trabajo a conectar a personas con oportunidades que cambian sus vidas en uno de los lugares más hermosos del mundo.</w:t>
+        <w:br/>
+        <w:br/>
+        <w:t>No somos representantes corporativos. Somos vosotros — Realtors que se atrevieron a dar el salto. Y es exactamente por eso que podemos ayudar a que vuestros clientes también lo den."</w:t>
       </w:r>
     </w:p>
     <w:p>
@@ -1094,7 +1209,7 @@
     </w:p>
     <w:p>
       <w:pPr>
-        <w:spacing w:before="40" w:after="120"/>
+        <w:spacing w:before="40" w:after="80"/>
         <w:ind w:left="850"/>
       </w:pPr>
       <w:r>
@@ -1108,6 +1223,34 @@
     </w:p>
     <w:p>
       <w:pPr>
+        <w:spacing w:before="100" w:after="40"/>
+        <w:ind w:left="567"/>
+      </w:pPr>
+      <w:r>
+        <w:rPr>
+          <w:b/>
+          <w:color w:val="2266AA"/>
+          <w:sz w:val="19"/>
+        </w:rPr>
+        <w:t>🇪🇸  Versión en español:</w:t>
+      </w:r>
+    </w:p>
+    <w:p>
+      <w:pPr>
+        <w:spacing w:before="40" w:after="160"/>
+        <w:ind w:left="850"/>
+      </w:pPr>
+      <w:r>
+        <w:rPr>
+          <w:i/>
+          <w:color w:val="111144"/>
+          <w:sz w:val="21"/>
+        </w:rPr>
+        <w:t>"Hemos estado exactamente en vuestra posición: escuchando a clientes hablar de mudarse al extranjero, sin saber cómo ayudarles, y perdiéndoles sin hacer ruido. Hoy vamos a solucionar eso. Para siempre."</w:t>
+      </w:r>
+    </w:p>
+    <w:p>
+      <w:pPr>
         <w:pStyle w:val="Heading2"/>
         <w:spacing w:before="240" w:after="80"/>
       </w:pPr>
@@ -1145,12 +1288,12 @@
           <w:color w:val="444444"/>
           <w:sz w:val="20"/>
         </w:rPr>
-        <w:t>GUIÓN (Agente 1 — testimonio emocional):</w:t>
+        <w:t>GUIÓN EN INGLÉS (Agente 1 — testimonio emocional):</w:t>
       </w:r>
     </w:p>
     <w:p>
       <w:pPr>
-        <w:spacing w:before="40" w:after="120"/>
+        <w:spacing w:before="40" w:after="80"/>
         <w:ind w:left="850"/>
       </w:pPr>
       <w:r>
@@ -1173,6 +1316,57 @@
     </w:p>
     <w:p>
       <w:pPr>
+        <w:spacing w:before="100" w:after="40"/>
+        <w:ind w:left="567"/>
+      </w:pPr>
+      <w:r>
+        <w:rPr>
+          <w:b/>
+          <w:color w:val="2266AA"/>
+          <w:sz w:val="19"/>
+        </w:rPr>
+        <w:t>🇪🇸  Versión en español:</w:t>
+      </w:r>
+    </w:p>
+    <w:p>
+      <w:pPr>
+        <w:spacing w:before="40" w:after="40"/>
+        <w:ind w:left="567"/>
+      </w:pPr>
+      <w:r>
+        <w:rPr>
+          <w:b/>
+          <w:color w:val="224488"/>
+          <w:sz w:val="20"/>
+        </w:rPr>
+        <w:t>GUIÓN EN ESPAÑOL (Agente 1 — testimonio emocional):</w:t>
+      </w:r>
+    </w:p>
+    <w:p>
+      <w:pPr>
+        <w:spacing w:before="40" w:after="160"/>
+        <w:ind w:left="850"/>
+      </w:pPr>
+      <w:r>
+        <w:rPr>
+          <w:i/>
+          <w:color w:val="111144"/>
+          <w:sz w:val="21"/>
+        </w:rPr>
+        <w:t>"Dejadme 60 segundos para pintaros una imagen de mi martes típico.</w:t>
+        <w:br/>
+        <w:br/>
+        <w:t>Me despierto a las 7:30 de la mañana. Entra luz del sol por la ventana. Desayuno en mi terraza con vistas al Mediterráneo. A las 9 estoy en la oficina — y hablo de una oficina de verdad, con equipo, con sistemas, con toda la infraestructura de RE/MAX detrás de mí. Paso la mañana en llamadas con clientes en California, Texas, Nueva York. A la 1 del mediodía ya he terminado la mayoría de mis reuniones digitales.</w:t>
+        <w:br/>
+        <w:br/>
+        <w:t>Después conduzco 8 minutos hasta la playa para comer.</w:t>
+        <w:br/>
+        <w:br/>
+        <w:t>Esa es la vida que vendo. Y lo importante es que — es mi vida real. No necesito exagerar nada. Solo necesito mostrarla."</w:t>
+      </w:r>
+    </w:p>
+    <w:p>
+      <w:pPr>
         <w:spacing w:before="120" w:after="40"/>
         <w:ind w:left="567"/>
       </w:pPr>
@@ -1182,12 +1376,12 @@
           <w:color w:val="444444"/>
           <w:sz w:val="20"/>
         </w:rPr>
-        <w:t>GUIÓN (Agente 2 — testimonio canadiense):</w:t>
+        <w:t>GUIÓN EN INGLÉS (Agente 2 — testimonio canadiense):</w:t>
       </w:r>
     </w:p>
     <w:p>
       <w:pPr>
-        <w:spacing w:before="40" w:after="120"/>
+        <w:spacing w:before="40" w:after="80"/>
         <w:ind w:left="850"/>
       </w:pPr>
       <w:r>
@@ -1200,6 +1394,51 @@
         <w:br/>
         <w:br/>
         <w:t>My clients from Canada always ask me: 'Is it really that good?' And I show them my utility bills, my grocery receipts, my kids' school grades — and then I invite them to come see it for themselves. The VIP tour we organize does the closing. Not me. Spain does the closing."</w:t>
+      </w:r>
+    </w:p>
+    <w:p>
+      <w:pPr>
+        <w:spacing w:before="100" w:after="40"/>
+        <w:ind w:left="567"/>
+      </w:pPr>
+      <w:r>
+        <w:rPr>
+          <w:b/>
+          <w:color w:val="2266AA"/>
+          <w:sz w:val="19"/>
+        </w:rPr>
+        <w:t>🇪🇸  Versión en español:</w:t>
+      </w:r>
+    </w:p>
+    <w:p>
+      <w:pPr>
+        <w:spacing w:before="40" w:after="40"/>
+        <w:ind w:left="567"/>
+      </w:pPr>
+      <w:r>
+        <w:rPr>
+          <w:b/>
+          <w:color w:val="224488"/>
+          <w:sz w:val="20"/>
+        </w:rPr>
+        <w:t>GUIÓN EN ESPAÑOL (Agente 2 — testimonio canadiense):</w:t>
+      </w:r>
+    </w:p>
+    <w:p>
+      <w:pPr>
+        <w:spacing w:before="40" w:after="160"/>
+        <w:ind w:left="850"/>
+      </w:pPr>
+      <w:r>
+        <w:rPr>
+          <w:i/>
+          <w:color w:val="111144"/>
+          <w:sz w:val="21"/>
+        </w:rPr>
+        <w:t>"Para mí, el punto de inflexión fue la sanidad. En Canadá, pagaba una fortuna en impuestos y aun así esperaba meses para ver a un especialista. Aquí, toda mi familia tiene cobertura sanitaria privada de primer nivel por menos de 200 dólares al mes.</w:t>
+        <w:br/>
+        <w:br/>
+        <w:t>Mis clientes canadienses siempre me preguntan: "¿De verdad es tan bueno?" Y les enseño mis facturas de suministros, mis tickets del supermercado, las notas de mis hijos en el colegio — y luego los invito a venir a verlo por sí mismos. El VIP Tour que organizamos es el que cierra la venta. No yo. España cierra la venta."</w:t>
       </w:r>
     </w:p>
     <w:p>
@@ -1227,12 +1466,12 @@
           <w:color w:val="444444"/>
           <w:sz w:val="20"/>
         </w:rPr>
-        <w:t>GUIÓN:</w:t>
+        <w:t>GUIÓN EN INGLÉS:</w:t>
       </w:r>
     </w:p>
     <w:p>
       <w:pPr>
-        <w:spacing w:before="40" w:after="120"/>
+        <w:spacing w:before="40" w:after="80"/>
         <w:ind w:left="850"/>
       </w:pPr>
       <w:r>
@@ -1244,13 +1483,64 @@
         <w:t>"Here's what we're going to cover today — and I promise we'll stay tight on time because I know you have clients to call.</w:t>
         <w:br/>
         <w:br/>
-        <w:t>First, we'll show you the data — the migration numbers that prove this isn't a trend, it's a structural shift. Second, you're going to meet our full ecosystem of partners: a legal team, a mortgage specialist, a vacation rental management company, and our marketing team — because we don't just sell houses, we deliver a complete transition service. Third, we'll break down the commission math — exactly how your 25% works and what it looks like on a real deal. And finally, we'll do a live demo of our partner portal so you can see exactly how simple it is to send us a referral.</w:t>
+        <w:t>First, we'll show you the data — the migration numbers that prove this isn't a trend, it's a structural shift. Second, you're going to meet our full ecosystem of partners: a legal team, a mortgage specialist, and a vacation rental management company — because we don't just sell houses, we deliver a complete transition service. Third, we'll break down the commission math — exactly how your 25% works and what it looks like on a real deal. And finally, we'll do a live demo of our partner portal so you can see exactly how simple it is to send us a referral.</w:t>
         <w:br/>
         <w:br/>
         <w:t>Any questions along the way, drop them in the chat — we'll address everything in the Q&amp;A at the end.</w:t>
         <w:br/>
         <w:br/>
         <w:t>Let's get started."</w:t>
+      </w:r>
+    </w:p>
+    <w:p>
+      <w:pPr>
+        <w:spacing w:before="100" w:after="40"/>
+        <w:ind w:left="567"/>
+      </w:pPr>
+      <w:r>
+        <w:rPr>
+          <w:b/>
+          <w:color w:val="2266AA"/>
+          <w:sz w:val="19"/>
+        </w:rPr>
+        <w:t>🇪🇸  Versión en español:</w:t>
+      </w:r>
+    </w:p>
+    <w:p>
+      <w:pPr>
+        <w:spacing w:before="40" w:after="40"/>
+        <w:ind w:left="567"/>
+      </w:pPr>
+      <w:r>
+        <w:rPr>
+          <w:b/>
+          <w:color w:val="224488"/>
+          <w:sz w:val="20"/>
+        </w:rPr>
+        <w:t>GUIÓN EN ESPAÑOL:</w:t>
+      </w:r>
+    </w:p>
+    <w:p>
+      <w:pPr>
+        <w:spacing w:before="40" w:after="160"/>
+        <w:ind w:left="850"/>
+      </w:pPr>
+      <w:r>
+        <w:rPr>
+          <w:i/>
+          <w:color w:val="111144"/>
+          <w:sz w:val="21"/>
+        </w:rPr>
+        <w:t>"Esto es lo que vamos a cubrir hoy — y os prometo que respetaremos el tiempo porque sé que tenéis clientes a los que llamar.</w:t>
+        <w:br/>
+        <w:br/>
+        <w:t>Primero, os mostraremos los datos — las cifras de migración que demuestran que esto no es una tendencia pasajera, sino un cambio estructural. Segundo, conoceréis nuestro ecosistema completo de partners: un equipo legal, un especialista en hipotecas y una empresa de gestión de alquileres vacacionales — porque no solo vendemos casas, ofrecemos un servicio de transición completo. Tercero, desglosaremos la fórmula de la comisión — exactamente cómo funciona vuestro 25% y cómo queda en una operación real. Y por último, haremos una demo en vivo del portal de partners para que veáis lo sencillo que es enviarnos una referencia.</w:t>
+        <w:br/>
+        <w:br/>
+        <w:t>Cualquier pregunta durante la sesión, déjadla en el chat — lo resolveremos todo en el Q&amp;A del final.</w:t>
+        <w:br/>
+        <w:br/>
+        <w:t>¡Empezamos!"</w:t>
       </w:r>
     </w:p>
     <w:p>
@@ -1332,12 +1622,12 @@
           <w:color w:val="444444"/>
           <w:sz w:val="20"/>
         </w:rPr>
-        <w:t>GUIÓN:</w:t>
+        <w:t>GUIÓN EN INGLÉS:</w:t>
       </w:r>
     </w:p>
     <w:p>
       <w:pPr>
-        <w:spacing w:before="40" w:after="120"/>
+        <w:spacing w:before="40" w:after="80"/>
         <w:ind w:left="850"/>
       </w:pPr>
       <w:r>
@@ -1362,6 +1652,63 @@
         <w:br/>
         <w:br/>
         <w:t>Now look at these numbers."</w:t>
+      </w:r>
+    </w:p>
+    <w:p>
+      <w:pPr>
+        <w:spacing w:before="100" w:after="40"/>
+        <w:ind w:left="567"/>
+      </w:pPr>
+      <w:r>
+        <w:rPr>
+          <w:b/>
+          <w:color w:val="2266AA"/>
+          <w:sz w:val="19"/>
+        </w:rPr>
+        <w:t>🇪🇸  Versión en español:</w:t>
+      </w:r>
+    </w:p>
+    <w:p>
+      <w:pPr>
+        <w:spacing w:before="40" w:after="40"/>
+        <w:ind w:left="567"/>
+      </w:pPr>
+      <w:r>
+        <w:rPr>
+          <w:b/>
+          <w:color w:val="224488"/>
+          <w:sz w:val="20"/>
+        </w:rPr>
+        <w:t>GUIÓN EN ESPAÑOL:</w:t>
+      </w:r>
+    </w:p>
+    <w:p>
+      <w:pPr>
+        <w:spacing w:before="40" w:after="160"/>
+        <w:ind w:left="850"/>
+      </w:pPr>
+      <w:r>
+        <w:rPr>
+          <w:i/>
+          <w:color w:val="111144"/>
+          <w:sz w:val="21"/>
+        </w:rPr>
+        <w:t>"Dejadme haceros una pregunta. En los últimos 12 meses, ¿cuántos de vuestros clientes han mencionado que están pensando en mudarse al extranjero? ¿Quizás a México, Costa Rica, Portugal, España?</w:t>
+        <w:br/>
+        <w:br/>
+        <w:t>Escribid un número en el chat ahora mismo. Tengo genuina curiosidad.</w:t>
+        <w:br/>
+        <w:br/>
+        <w:t>[Pausa de 15 segundos para respuestas del chat.]</w:t>
+        <w:br/>
+        <w:br/>
+        <w:t>Exacto. Todos y cada uno de vosotros habéis tenido esa conversación. Y aquí está el problema: la mayoría de nosotros, cuando ese cliente dice "estoy pensando en España", sonreímos, decimos "¡qué emocionante!" — y luego lo perdemos. Porque no tenemos la infraestructura para ayudarle.</w:t>
+        <w:br/>
+        <w:br/>
+        <w:t>Hasta hoy.</w:t>
+        <w:br/>
+        <w:br/>
+        <w:t>Ahora mirad estas cifras."</w:t>
       </w:r>
     </w:p>
     <w:p>
@@ -1455,7 +1802,7 @@
     </w:p>
     <w:p>
       <w:pPr>
-        <w:spacing w:before="40" w:after="120"/>
+        <w:spacing w:before="40" w:after="80"/>
         <w:ind w:left="850"/>
       </w:pPr>
       <w:r>
@@ -1469,6 +1816,34 @@
     </w:p>
     <w:p>
       <w:pPr>
+        <w:spacing w:before="100" w:after="40"/>
+        <w:ind w:left="567"/>
+      </w:pPr>
+      <w:r>
+        <w:rPr>
+          <w:b/>
+          <w:color w:val="2266AA"/>
+          <w:sz w:val="19"/>
+        </w:rPr>
+        <w:t>🇪🇸  Versión en español:</w:t>
+      </w:r>
+    </w:p>
+    <w:p>
+      <w:pPr>
+        <w:spacing w:before="40" w:after="160"/>
+        <w:ind w:left="850"/>
+      </w:pPr>
+      <w:r>
+        <w:rPr>
+          <w:i/>
+          <w:color w:val="111144"/>
+          <w:sz w:val="21"/>
+        </w:rPr>
+        <w:t>"Estas no son proyecciones. No son cifras de marketing. Son estadísticas oficiales documentadas. La demanda existe. La pregunta es: ¿quién va a captarla?"</w:t>
+      </w:r>
+    </w:p>
+    <w:p>
+      <w:pPr>
         <w:pStyle w:val="Heading2"/>
         <w:spacing w:before="240" w:after="80"/>
       </w:pPr>
@@ -1506,12 +1881,12 @@
           <w:color w:val="444444"/>
           <w:sz w:val="20"/>
         </w:rPr>
-        <w:t>GUIÓN:</w:t>
+        <w:t>GUIÓN EN INGLÉS:</w:t>
       </w:r>
     </w:p>
     <w:p>
       <w:pPr>
-        <w:spacing w:before="40" w:after="120"/>
+        <w:spacing w:before="40" w:after="80"/>
         <w:ind w:left="850"/>
       </w:pPr>
       <w:r>
@@ -1528,6 +1903,51 @@
     </w:p>
     <w:p>
       <w:pPr>
+        <w:spacing w:before="100" w:after="40"/>
+        <w:ind w:left="567"/>
+      </w:pPr>
+      <w:r>
+        <w:rPr>
+          <w:b/>
+          <w:color w:val="2266AA"/>
+          <w:sz w:val="19"/>
+        </w:rPr>
+        <w:t>🇪🇸  Versión en español:</w:t>
+      </w:r>
+    </w:p>
+    <w:p>
+      <w:pPr>
+        <w:spacing w:before="40" w:after="40"/>
+        <w:ind w:left="567"/>
+      </w:pPr>
+      <w:r>
+        <w:rPr>
+          <w:b/>
+          <w:color w:val="224488"/>
+          <w:sz w:val="20"/>
+        </w:rPr>
+        <w:t>GUIÓN EN ESPAÑOL:</w:t>
+      </w:r>
+    </w:p>
+    <w:p>
+      <w:pPr>
+        <w:spacing w:before="40" w:after="160"/>
+        <w:ind w:left="850"/>
+      </w:pPr>
+      <w:r>
+        <w:rPr>
+          <w:i/>
+          <w:color w:val="111144"/>
+          <w:sz w:val="21"/>
+        </w:rPr>
+        <w:t>"Ahora hablemos de POR QUÉ van a España concretamente. Porque vuestros clientes os lo van a preguntar — y necesitáis tener estas respuestas preparadas.</w:t>
+        <w:br/>
+        <w:br/>
+        <w:t>Hay cinco motores fundamentales. Yo los llamo las Cinco Fuerzas del Boom Expat en España."</w:t>
+      </w:r>
+    </w:p>
+    <w:p>
+      <w:pPr>
         <w:spacing w:before="160"/>
         <w:jc w:val="left"/>
       </w:pPr>
@@ -1538,12 +1958,12 @@
           <w:color w:val="C88600"/>
           <w:sz w:val="22"/>
         </w:rPr>
-        <w:t>🟡 Fuerza 1 — Costo de vida:</w:t>
+        <w:t>🟡 Force 1 — Cost of living (EN):</w:t>
       </w:r>
     </w:p>
     <w:p>
       <w:pPr>
-        <w:spacing w:before="40" w:after="120"/>
+        <w:spacing w:before="40" w:after="80"/>
         <w:ind w:left="850"/>
       </w:pPr>
       <w:r>
@@ -1557,6 +1977,49 @@
     </w:p>
     <w:p>
       <w:pPr>
+        <w:spacing w:before="80"/>
+        <w:jc w:val="left"/>
+      </w:pPr>
+      <w:r>
+        <w:rPr>
+          <w:b/>
+          <w:i w:val="0"/>
+          <w:color w:val="224488"/>
+          <w:sz w:val="22"/>
+        </w:rPr>
+        <w:t>🟡 Fuerza 1 — Coste de vida (ES):</w:t>
+      </w:r>
+    </w:p>
+    <w:p>
+      <w:pPr>
+        <w:spacing w:before="100" w:after="40"/>
+        <w:ind w:left="567"/>
+      </w:pPr>
+      <w:r>
+        <w:rPr>
+          <w:b/>
+          <w:color w:val="2266AA"/>
+          <w:sz w:val="19"/>
+        </w:rPr>
+        <w:t>🇪🇸  Versión en español:</w:t>
+      </w:r>
+    </w:p>
+    <w:p>
+      <w:pPr>
+        <w:spacing w:before="40" w:after="160"/>
+        <w:ind w:left="850"/>
+      </w:pPr>
+      <w:r>
+        <w:rPr>
+          <w:i/>
+          <w:color w:val="111144"/>
+          <w:sz w:val="21"/>
+        </w:rPr>
+        <w:t>"Primero: el coste de vida. La familia norteamericana media que se traslada desde una gran área metropolitana ahorra entre el 40% y el 60% en sus gastos mensuales. Hablamos de alimentación, suministros, transporte, comer fuera — absolutamente todo. Un apartamento en primera línea de playa en Alicante por 350.000 euros costaría más de un millón en Miami. No es una estimación, es una comparativa de listados que os puedo mostrar ahora mismo."</w:t>
+      </w:r>
+    </w:p>
+    <w:p>
+      <w:pPr>
         <w:spacing w:before="160"/>
         <w:jc w:val="left"/>
       </w:pPr>
@@ -1567,12 +2030,12 @@
           <w:color w:val="C88600"/>
           <w:sz w:val="22"/>
         </w:rPr>
-        <w:t>🟡 Fuerza 2 — Sanidad:</w:t>
+        <w:t>🟡 Force 2 — Healthcare (EN):</w:t>
       </w:r>
     </w:p>
     <w:p>
       <w:pPr>
-        <w:spacing w:before="40" w:after="120"/>
+        <w:spacing w:before="40" w:after="80"/>
         <w:ind w:left="850"/>
       </w:pPr>
       <w:r>
@@ -1586,6 +2049,49 @@
     </w:p>
     <w:p>
       <w:pPr>
+        <w:spacing w:before="80"/>
+        <w:jc w:val="left"/>
+      </w:pPr>
+      <w:r>
+        <w:rPr>
+          <w:b/>
+          <w:i w:val="0"/>
+          <w:color w:val="224488"/>
+          <w:sz w:val="22"/>
+        </w:rPr>
+        <w:t>🟡 Fuerza 2 — Sanidad (ES):</w:t>
+      </w:r>
+    </w:p>
+    <w:p>
+      <w:pPr>
+        <w:spacing w:before="100" w:after="40"/>
+        <w:ind w:left="567"/>
+      </w:pPr>
+      <w:r>
+        <w:rPr>
+          <w:b/>
+          <w:color w:val="2266AA"/>
+          <w:sz w:val="19"/>
+        </w:rPr>
+        <w:t>🇪🇸  Versión en español:</w:t>
+      </w:r>
+    </w:p>
+    <w:p>
+      <w:pPr>
+        <w:spacing w:before="40" w:after="160"/>
+        <w:ind w:left="850"/>
+      </w:pPr>
+      <w:r>
+        <w:rPr>
+          <w:i/>
+          <w:color w:val="111144"/>
+          <w:sz w:val="21"/>
+        </w:rPr>
+        <w:t>"Segundo: la sanidad. España ocupa el puesto número 7 del mundo en calidad sanitaria [OMS], frente al puesto 37 de Estados Unidos. Un seguro médico privado completo para una familia de cuatro personas en España cuesta aproximadamente entre 250 y 400 euros al mes. En Estados Unidos, esa misma cobertura son 2.000 dólares o más. Para vuestros clientes que están en la previa de la jubilación o que pagan primas de seguro desorbitadas, esto por sí solo justifica el traslado."</w:t>
+      </w:r>
+    </w:p>
+    <w:p>
+      <w:pPr>
         <w:spacing w:before="160"/>
         <w:jc w:val="left"/>
       </w:pPr>
@@ -1596,12 +2102,12 @@
           <w:color w:val="C88600"/>
           <w:sz w:val="22"/>
         </w:rPr>
-        <w:t>🟡 Fuerza 3 — Seguridad:</w:t>
+        <w:t>🟡 Force 3 — Safety (EN):</w:t>
       </w:r>
     </w:p>
     <w:p>
       <w:pPr>
-        <w:spacing w:before="40" w:after="120"/>
+        <w:spacing w:before="40" w:after="80"/>
         <w:ind w:left="850"/>
       </w:pPr>
       <w:r>
@@ -1615,6 +2121,49 @@
     </w:p>
     <w:p>
       <w:pPr>
+        <w:spacing w:before="80"/>
+        <w:jc w:val="left"/>
+      </w:pPr>
+      <w:r>
+        <w:rPr>
+          <w:b/>
+          <w:i w:val="0"/>
+          <w:color w:val="224488"/>
+          <w:sz w:val="22"/>
+        </w:rPr>
+        <w:t>🟡 Fuerza 3 — Seguridad (ES):</w:t>
+      </w:r>
+    </w:p>
+    <w:p>
+      <w:pPr>
+        <w:spacing w:before="100" w:after="40"/>
+        <w:ind w:left="567"/>
+      </w:pPr>
+      <w:r>
+        <w:rPr>
+          <w:b/>
+          <w:color w:val="2266AA"/>
+          <w:sz w:val="19"/>
+        </w:rPr>
+        <w:t>🇪🇸  Versión en español:</w:t>
+      </w:r>
+    </w:p>
+    <w:p>
+      <w:pPr>
+        <w:spacing w:before="40" w:after="160"/>
+        <w:ind w:left="850"/>
+      </w:pPr>
+      <w:r>
+        <w:rPr>
+          <w:i/>
+          <w:color w:val="111144"/>
+          <w:sz w:val="21"/>
+        </w:rPr>
+        <w:t>"Tercero: la seguridad. España se posiciona sistemáticamente entre los 10 países más seguros del mundo [Índice de Paz Global]. La violencia con armas de fuego, como factor de riesgo, es prácticamente inexistente. Para familias con hijos, para jubilados, para cualquiera que se preocupe por la seguridad personal — España es un refugio."</w:t>
+      </w:r>
+    </w:p>
+    <w:p>
+      <w:pPr>
         <w:spacing w:before="160"/>
         <w:jc w:val="left"/>
       </w:pPr>
@@ -1625,12 +2174,12 @@
           <w:color w:val="C88600"/>
           <w:sz w:val="22"/>
         </w:rPr>
-        <w:t>🟡 Fuerza 4 — Clima:</w:t>
+        <w:t>🟡 Force 4 — Climate (EN):</w:t>
       </w:r>
     </w:p>
     <w:p>
       <w:pPr>
-        <w:spacing w:before="40" w:after="120"/>
+        <w:spacing w:before="40" w:after="80"/>
         <w:ind w:left="850"/>
       </w:pPr>
       <w:r>
@@ -1644,6 +2193,49 @@
     </w:p>
     <w:p>
       <w:pPr>
+        <w:spacing w:before="80"/>
+        <w:jc w:val="left"/>
+      </w:pPr>
+      <w:r>
+        <w:rPr>
+          <w:b/>
+          <w:i w:val="0"/>
+          <w:color w:val="224488"/>
+          <w:sz w:val="22"/>
+        </w:rPr>
+        <w:t>🟡 Fuerza 4 — Clima (ES):</w:t>
+      </w:r>
+    </w:p>
+    <w:p>
+      <w:pPr>
+        <w:spacing w:before="100" w:after="40"/>
+        <w:ind w:left="567"/>
+      </w:pPr>
+      <w:r>
+        <w:rPr>
+          <w:b/>
+          <w:color w:val="2266AA"/>
+          <w:sz w:val="19"/>
+        </w:rPr>
+        <w:t>🇪🇸  Versión en español:</w:t>
+      </w:r>
+    </w:p>
+    <w:p>
+      <w:pPr>
+        <w:spacing w:before="40" w:after="160"/>
+        <w:ind w:left="850"/>
+      </w:pPr>
+      <w:r>
+        <w:rPr>
+          <w:i/>
+          <w:color w:val="111144"/>
+          <w:sz w:val="21"/>
+        </w:rPr>
+        <w:t>"Cuarto: el clima. La Costa Blanca — nuestro mercado principal — tiene más de 320 días de sol al año. Las temperaturas medias en invierno son de 14°C a 18°C — entre 57 y 65°F. Para nuestros clientes canadienses especialmente, esto es transformador. Están cambiando seis meses de oscuridad y tuberías congeladas por un estilo de vida mediterráneo. No hay comparación posible."</w:t>
+      </w:r>
+    </w:p>
+    <w:p>
+      <w:pPr>
         <w:spacing w:before="160"/>
         <w:jc w:val="left"/>
       </w:pPr>
@@ -1654,12 +2246,12 @@
           <w:color w:val="C88600"/>
           <w:sz w:val="22"/>
         </w:rPr>
-        <w:t>🟡 Fuerza 5 — Visados y residencia:</w:t>
+        <w:t>🟡 Force 5 — Visas &amp; residency (EN):</w:t>
       </w:r>
     </w:p>
     <w:p>
       <w:pPr>
-        <w:spacing w:before="40" w:after="120"/>
+        <w:spacing w:before="40" w:after="80"/>
         <w:ind w:left="850"/>
       </w:pPr>
       <w:r>
@@ -1675,6 +2267,55 @@
         <w:br/>
         <w:br/>
         <w:t>Our legal partner — Fuster &amp; Associates, whom you'll meet shortly — handles all of this. Your clients don't need to figure it out alone. They just need to call us."</w:t>
+      </w:r>
+    </w:p>
+    <w:p>
+      <w:pPr>
+        <w:spacing w:before="80"/>
+        <w:jc w:val="left"/>
+      </w:pPr>
+      <w:r>
+        <w:rPr>
+          <w:b/>
+          <w:i w:val="0"/>
+          <w:color w:val="224488"/>
+          <w:sz w:val="22"/>
+        </w:rPr>
+        <w:t>🟡 Fuerza 5 — Visados y residencia (ES):</w:t>
+      </w:r>
+    </w:p>
+    <w:p>
+      <w:pPr>
+        <w:spacing w:before="100" w:after="40"/>
+        <w:ind w:left="567"/>
+      </w:pPr>
+      <w:r>
+        <w:rPr>
+          <w:b/>
+          <w:color w:val="2266AA"/>
+          <w:sz w:val="19"/>
+        </w:rPr>
+        <w:t>🇪🇸  Versión en español:</w:t>
+      </w:r>
+    </w:p>
+    <w:p>
+      <w:pPr>
+        <w:spacing w:before="40" w:after="160"/>
+        <w:ind w:left="850"/>
+      </w:pPr>
+      <w:r>
+        <w:rPr>
+          <w:i/>
+          <w:color w:val="111144"/>
+          <w:sz w:val="21"/>
+        </w:rPr>
+        <w:t>"Y quinto — y esto es lo que realmente está impulsando la ola actual — el panorama de visados en España nunca ha sido tan favorable para los norteamericanos.</w:t>
+        <w:br/>
+        <w:br/>
+        <w:t>La Visa de No Lucrativa es perfecta para jubilados y personas con ingresos pasivos. La Visa de Nómada Digital, lanzada en 2023, permite a los trabajadores remotos vivir legalmente en España hasta 5 años. La Golden Visa permite a inversores inmobiliarios de 500.000 euros o más obtener la residencia completa para toda la familia.</w:t>
+        <w:br/>
+        <w:br/>
+        <w:t>Nuestro partner legal — Fuster &amp; Associates, a quien conoceréis enseguida — gestiona todo esto. Vuestros clientes no necesitan resolverlo solos. Solo necesitan llamarnos."</w:t>
       </w:r>
     </w:p>
     <w:p>
@@ -1716,12 +2357,12 @@
           <w:color w:val="444444"/>
           <w:sz w:val="20"/>
         </w:rPr>
-        <w:t>GUIÓN:</w:t>
+        <w:t>GUIÓN EN INGLÉS:</w:t>
       </w:r>
     </w:p>
     <w:p>
       <w:pPr>
-        <w:spacing w:before="40" w:after="120"/>
+        <w:spacing w:before="40" w:after="80"/>
         <w:ind w:left="850"/>
       </w:pPr>
       <w:r>
@@ -1740,6 +2381,57 @@
         <w:br/>
         <w:br/>
         <w:t>Let's talk about how."</w:t>
+      </w:r>
+    </w:p>
+    <w:p>
+      <w:pPr>
+        <w:spacing w:before="100" w:after="40"/>
+        <w:ind w:left="567"/>
+      </w:pPr>
+      <w:r>
+        <w:rPr>
+          <w:b/>
+          <w:color w:val="2266AA"/>
+          <w:sz w:val="19"/>
+        </w:rPr>
+        <w:t>🇪🇸  Versión en español:</w:t>
+      </w:r>
+    </w:p>
+    <w:p>
+      <w:pPr>
+        <w:spacing w:before="40" w:after="40"/>
+        <w:ind w:left="567"/>
+      </w:pPr>
+      <w:r>
+        <w:rPr>
+          <w:b/>
+          <w:color w:val="224488"/>
+          <w:sz w:val="20"/>
+        </w:rPr>
+        <w:t>GUIÓN EN ESPAÑOL:</w:t>
+      </w:r>
+    </w:p>
+    <w:p>
+      <w:pPr>
+        <w:spacing w:before="40" w:after="160"/>
+        <w:ind w:left="850"/>
+      </w:pPr>
+      <w:r>
+        <w:rPr>
+          <w:i/>
+          <w:color w:val="111144"/>
+          <w:sz w:val="21"/>
+        </w:rPr>
+        <w:t>"Esto es lo que quiero que interioricéis de verdad: vuestros clientes NO están esperando vuestro permiso para explorar esto. Ya están buscando en Google "cómo mudarse a España", ya están en grupos de Facebook, ya están viendo vídeos de YouTube de expats en Valencia y Alicante.</w:t>
+        <w:br/>
+        <w:br/>
+        <w:t>La pregunta no es SI van a explorarlo. La pregunta es: ¿vais a ser vosotros quienes les guíen, o van a encontrar a otra persona en internet y desaparecer de vuestro pipeline para siempre?</w:t>
+        <w:br/>
+        <w:br/>
+        <w:t>Nosotros os damos las herramientas, el equipo y la infraestructura para ser ESA persona.</w:t>
+        <w:br/>
+        <w:br/>
+        <w:t>Hablemos de cómo."</w:t>
       </w:r>
     </w:p>
     <w:p>
@@ -1779,7 +2471,7 @@
           <w:color w:val="808080"/>
           <w:sz w:val="20"/>
         </w:rPr>
-        <w:t>⏰ 20:00 – 35:00 | Hablan: Partners Invitados</w:t>
+        <w:t>⏰ 20:00 – 32:00 | Hablan: Partners Invitados</w:t>
       </w:r>
     </w:p>
     <w:p>
@@ -1807,12 +2499,12 @@
           <w:color w:val="444444"/>
           <w:sz w:val="20"/>
         </w:rPr>
-        <w:t>GUIÓN (Agente 1 — introduce el bloque):</w:t>
+        <w:t>GUIÓN EN INGLÉS (Agente 1 — introduce el bloque):</w:t>
       </w:r>
     </w:p>
     <w:p>
       <w:pPr>
-        <w:spacing w:before="40" w:after="120"/>
+        <w:spacing w:before="40" w:after="80"/>
         <w:ind w:left="850"/>
       </w:pPr>
       <w:r>
@@ -1827,13 +2519,67 @@
         <w:t>This fear is completely legitimate. And it's exactly why we built what we call our 360° Ecosystem.</w:t>
         <w:br/>
         <w:br/>
-        <w:t>We don't sell properties in isolation. We deliver a complete, end-to-end service covering legal, financial, property management, and marketing support — all under one coordinated team.</w:t>
-        <w:br/>
-        <w:br/>
-        <w:t>I'd like to introduce you to the specialists who make this possible. Each of them is going to take about two minutes to explain what they do and why it matters for your clients. Pay attention — because this ecosystem is what makes our offer completely unique in the market.</w:t>
+        <w:t>We don't sell properties in isolation. We deliver a complete, end-to-end service covering legal, financial, and property management support — all under one coordinated team.</w:t>
+        <w:br/>
+        <w:br/>
+        <w:t>I'd like to introduce you to three specialists who make this possible. Each of them is going to take about two minutes to explain what they do and why it matters for your clients. Pay attention — because this ecosystem is what makes our offer completely unique in the market.</w:t>
         <w:br/>
         <w:br/>
         <w:t>Let me start with perhaps the most critical piece: legal security."</w:t>
+      </w:r>
+    </w:p>
+    <w:p>
+      <w:pPr>
+        <w:spacing w:before="100" w:after="40"/>
+        <w:ind w:left="567"/>
+      </w:pPr>
+      <w:r>
+        <w:rPr>
+          <w:b/>
+          <w:color w:val="2266AA"/>
+          <w:sz w:val="19"/>
+        </w:rPr>
+        <w:t>🇪🇸  Versión en español:</w:t>
+      </w:r>
+    </w:p>
+    <w:p>
+      <w:pPr>
+        <w:spacing w:before="40" w:after="40"/>
+        <w:ind w:left="567"/>
+      </w:pPr>
+      <w:r>
+        <w:rPr>
+          <w:b/>
+          <w:color w:val="224488"/>
+          <w:sz w:val="20"/>
+        </w:rPr>
+        <w:t>GUIÓN EN ESPAÑOL (Agente 1 — introduce el bloque):</w:t>
+      </w:r>
+    </w:p>
+    <w:p>
+      <w:pPr>
+        <w:spacing w:before="40" w:after="160"/>
+        <w:ind w:left="850"/>
+      </w:pPr>
+      <w:r>
+        <w:rPr>
+          <w:i/>
+          <w:color w:val="111144"/>
+          <w:sz w:val="21"/>
+        </w:rPr>
+        <w:t>"Ahora bien, el miedo número uno de un comprador norteamericano que se adentra en un mercado extranjero es: "¿Y si algo va mal? ¿Y si me estafan? ¿Y si pago impuestos que no conozco? ¿Y si el título de propiedad no está limpio?"</w:t>
+        <w:br/>
+        <w:br/>
+        <w:t>Este miedo es completamente legítimo. Y es exactamente por eso que construimos lo que llamamos nuestro Ecosistema 360°.</w:t>
+        <w:br/>
+        <w:br/>
+        <w:t>No vendemos propiedades de forma aislada. Ofrecemos un servicio completo, de principio a fin, que cubre el apoyo legal, financiero y de gestión de la propiedad — todo bajo un equipo coordinado.</w:t>
+        <w:br/>
+        <w:br/>
+        <w:t>Me gustaría presentaros a tres especialistas que hacen esto posible. Cada uno va a tomarse unos dos minutos para explicar qué hace y por qué es importante para vuestros clientes. Prestad atención — porque este ecosistema es lo que hace que nuestra oferta sea completamente única en el mercado.</w:t>
+        <w:br/>
+        <w:br/>
+        <w:t>Empecemos con quizás la pieza más crítica: la seguridad jurídica."</w:t>
       </w:r>
     </w:p>
     <w:p>
@@ -1875,12 +2621,12 @@
           <w:color w:val="444444"/>
           <w:sz w:val="20"/>
         </w:rPr>
-        <w:t>GUIÓN (Representante de Fuster):</w:t>
+        <w:t>GUIÓN EN INGLÉS (Representante de Fuster):</w:t>
       </w:r>
     </w:p>
     <w:p>
       <w:pPr>
-        <w:spacing w:before="40" w:after="120"/>
+        <w:spacing w:before="40" w:after="80"/>
         <w:ind w:left="850"/>
       </w:pPr>
       <w:r>
@@ -1911,6 +2657,69 @@
         <w:br/>
         <w:br/>
         <w:t>We look forward to protecting your clients' most important investment."</w:t>
+      </w:r>
+    </w:p>
+    <w:p>
+      <w:pPr>
+        <w:spacing w:before="100" w:after="40"/>
+        <w:ind w:left="567"/>
+      </w:pPr>
+      <w:r>
+        <w:rPr>
+          <w:b/>
+          <w:color w:val="2266AA"/>
+          <w:sz w:val="19"/>
+        </w:rPr>
+        <w:t>🇪🇸  Versión en español:</w:t>
+      </w:r>
+    </w:p>
+    <w:p>
+      <w:pPr>
+        <w:spacing w:before="40" w:after="40"/>
+        <w:ind w:left="567"/>
+      </w:pPr>
+      <w:r>
+        <w:rPr>
+          <w:b/>
+          <w:color w:val="224488"/>
+          <w:sz w:val="20"/>
+        </w:rPr>
+        <w:t>GUIÓN EN ESPAÑOL (Representante de Fuster):</w:t>
+      </w:r>
+    </w:p>
+    <w:p>
+      <w:pPr>
+        <w:spacing w:before="40" w:after="160"/>
+        <w:ind w:left="850"/>
+      </w:pPr>
+      <w:r>
+        <w:rPr>
+          <w:i/>
+          <w:color w:val="111144"/>
+          <w:sz w:val="21"/>
+        </w:rPr>
+        <w:t>"Hola a todos, soy [Nombre] de Fuster &amp; Associates. Somos un despacho de abogados bilingüe con sede en Alicante, y durante los últimos [X] años nos hemos especializado exclusivamente en asistir a compradores internacionales — especialmente de Estados Unidos, Canadá y Reino Unido — en la adquisición legal de su propiedad y en la obtención de su residencia en España.</w:t>
+        <w:br/>
+        <w:br/>
+        <w:t>Cuando vuestro cliente decide comprar en España, esto es lo que gestiona nuestro despacho:</w:t>
+        <w:br/>
+        <w:br/>
+        <w:t>Número uno — el NIE, que es el número de identificación fiscal español que necesita todo comprador no residente. Nosotros lo tramitamos en días, no en semanas.</w:t>
+        <w:br/>
+        <w:br/>
+        <w:t>Número dos — la diligencia debida sobre cada propiedad: escrituras, deudas pendientes, cumplimiento urbanístico. Vuestro cliente nunca comprará una propiedad con sorpresas ocultas.</w:t>
+        <w:br/>
+        <w:br/>
+        <w:t>Número tres — la redacción y revisión completa de los contratos de compraventa, negociados en inglés.</w:t>
+        <w:br/>
+        <w:br/>
+        <w:t>Número cuatro — las solicitudes de residencia. Ya sea la visa de no lucrativa, la visa de nómada digital o la Golden Visa, nuestro equipo de inmigración tiene un 98% de tasa de éxito.</w:t>
+        <w:br/>
+        <w:br/>
+        <w:t>Nuestro trabajo es hacer que el proceso legal sea completamente invisible para vuestro cliente — que lo viva como algo fluido, seguro y profesional. Vosotros, como Realtors referentes, quedáis como héroes por haberles enviado al equipo correcto.</w:t>
+        <w:br/>
+        <w:br/>
+        <w:t>Esperamos con entusiasmo proteger la inversión más importante de vuestros clientes."</w:t>
       </w:r>
     </w:p>
     <w:p>
@@ -1929,7 +2738,7 @@
     </w:p>
     <w:p>
       <w:pPr>
-        <w:spacing w:before="40" w:after="120"/>
+        <w:spacing w:before="40" w:after="80"/>
         <w:ind w:left="850"/>
       </w:pPr>
       <w:r>
@@ -1943,6 +2752,34 @@
     </w:p>
     <w:p>
       <w:pPr>
+        <w:spacing w:before="100" w:after="40"/>
+        <w:ind w:left="567"/>
+      </w:pPr>
+      <w:r>
+        <w:rPr>
+          <w:b/>
+          <w:color w:val="2266AA"/>
+          <w:sz w:val="19"/>
+        </w:rPr>
+        <w:t>🇪🇸  Versión en español:</w:t>
+      </w:r>
+    </w:p>
+    <w:p>
+      <w:pPr>
+        <w:spacing w:before="40" w:after="160"/>
+        <w:ind w:left="850"/>
+      </w:pPr>
+      <w:r>
+        <w:rPr>
+          <w:i/>
+          <w:color w:val="111144"/>
+          <w:sz w:val="21"/>
+        </w:rPr>
+        <w:t>"Gracias. Fuster es la razón por la que nuestros compradores duermen tranquilos. Ahora hablemos de algo más que también les quita el sueño: cómo financiar la propiedad."</w:t>
+      </w:r>
+    </w:p>
+    <w:p>
+      <w:pPr>
         <w:pStyle w:val="Heading2"/>
         <w:spacing w:before="240" w:after="80"/>
       </w:pPr>
@@ -1980,12 +2817,12 @@
           <w:color w:val="444444"/>
           <w:sz w:val="20"/>
         </w:rPr>
-        <w:t>GUIÓN (Representante de UCI):</w:t>
+        <w:t>GUIÓN EN INGLÉS (Representante de UCI):</w:t>
       </w:r>
     </w:p>
     <w:p>
       <w:pPr>
-        <w:spacing w:before="40" w:after="120"/>
+        <w:spacing w:before="40" w:after="80"/>
         <w:ind w:left="850"/>
       </w:pPr>
       <w:r>
@@ -2010,6 +2847,63 @@
         <w:br/>
         <w:br/>
         <w:t>We are here to make sure price is never the reason your client says no."</w:t>
+      </w:r>
+    </w:p>
+    <w:p>
+      <w:pPr>
+        <w:spacing w:before="100" w:after="40"/>
+        <w:ind w:left="567"/>
+      </w:pPr>
+      <w:r>
+        <w:rPr>
+          <w:b/>
+          <w:color w:val="2266AA"/>
+          <w:sz w:val="19"/>
+        </w:rPr>
+        <w:t>🇪🇸  Versión en español:</w:t>
+      </w:r>
+    </w:p>
+    <w:p>
+      <w:pPr>
+        <w:spacing w:before="40" w:after="40"/>
+        <w:ind w:left="567"/>
+      </w:pPr>
+      <w:r>
+        <w:rPr>
+          <w:b/>
+          <w:color w:val="224488"/>
+          <w:sz w:val="20"/>
+        </w:rPr>
+        <w:t>GUIÓN EN ESPAÑOL (Representante de UCI):</w:t>
+      </w:r>
+    </w:p>
+    <w:p>
+      <w:pPr>
+        <w:spacing w:before="40" w:after="160"/>
+        <w:ind w:left="850"/>
+      </w:pPr>
+      <w:r>
+        <w:rPr>
+          <w:i/>
+          <w:color w:val="111144"/>
+          <w:sz w:val="21"/>
+        </w:rPr>
+        <w:t>"Gracias. Soy [Nombre] de UCI — Unión de Créditos Inmobiliarios. Somos uno de los principales especialistas hipotecarios de España, y disponemos de una línea de productos dedicada específicamente a compradores no residentes, incluidos americanos y canadienses.</w:t>
+        <w:br/>
+        <w:br/>
+        <w:t>Existe un malentendido común: que los extranjeros no pueden obtener hipoteca en España. Eso es sencillamente falso.</w:t>
+        <w:br/>
+        <w:br/>
+        <w:t>Los compradores no residentes de EE.UU. y Canadá pueden acceder a hipotecas de hasta el 70% del valor de la propiedad a tipos fijos muy competitivos — actualmente en el rango del 2,8% al 3,5% — que son sustancialmente más bajos que los tipos hipotecarios actuales en EE.UU.</w:t>
+        <w:br/>
+        <w:br/>
+        <w:t>Nuestro proceso está diseñado para clientes internacionales: realizamos la verificación de ingresos basándonos en las declaraciones fiscales americanas o canadienses, contamos con asesores de habla inglesa y podemos emitir una preaprobación hipotecaria en tan solo 48 a 72 horas.</w:t>
+        <w:br/>
+        <w:br/>
+        <w:t>¿Por qué esto importa para vosotros como Realtors? Porque muchos de vuestros clientes que dicen "me encantaría comprar en España pero no puedo permitirme pagar al contado" en realidad SÍ pueden comprar en España con financiación. Nosotros eliminamos la barrera del pago en efectivo.</w:t>
+        <w:br/>
+        <w:br/>
+        <w:t>Estamos aquí para asegurarnos de que el precio nunca sea la razón por la que vuestro cliente diga que no."</w:t>
       </w:r>
     </w:p>
     <w:p>
@@ -2028,7 +2922,7 @@
     </w:p>
     <w:p>
       <w:pPr>
-        <w:spacing w:before="40" w:after="120"/>
+        <w:spacing w:before="40" w:after="80"/>
         <w:ind w:left="850"/>
       </w:pPr>
       <w:r>
@@ -2042,6 +2936,34 @@
     </w:p>
     <w:p>
       <w:pPr>
+        <w:spacing w:before="100" w:after="40"/>
+        <w:ind w:left="567"/>
+      </w:pPr>
+      <w:r>
+        <w:rPr>
+          <w:b/>
+          <w:color w:val="2266AA"/>
+          <w:sz w:val="19"/>
+        </w:rPr>
+        <w:t>🇪🇸  Versión en español:</w:t>
+      </w:r>
+    </w:p>
+    <w:p>
+      <w:pPr>
+        <w:spacing w:before="40" w:after="160"/>
+        <w:ind w:left="850"/>
+      </w:pPr>
+      <w:r>
+        <w:rPr>
+          <w:i/>
+          <w:color w:val="111144"/>
+          <w:sz w:val="21"/>
+        </w:rPr>
+        <w:t>"Sorprendente, ¿verdad? Tipos hipotecarios europeos significativamente más bajos que los que ven vuestros clientes en casa. Ahora bien, aquí hay una pregunta que recibo constantemente: "¿Y si mi cliente quiere comprar la propiedad pero solo vivir allí parte del año? ¿Puede generar ingresos con ella?" Absolutamente — y os explico cómo."</w:t>
+      </w:r>
+    </w:p>
+    <w:p>
+      <w:pPr>
         <w:pStyle w:val="Heading2"/>
         <w:spacing w:before="240" w:after="80"/>
       </w:pPr>
@@ -2079,12 +3001,12 @@
           <w:color w:val="444444"/>
           <w:sz w:val="20"/>
         </w:rPr>
-        <w:t>GUIÓN (Representante de Inmomás Holidays):</w:t>
+        <w:t>GUIÓN EN INGLÉS (Representante de Inmomás Holidays):</w:t>
       </w:r>
     </w:p>
     <w:p>
       <w:pPr>
-        <w:spacing w:before="40" w:after="120"/>
+        <w:spacing w:before="40" w:after="80"/>
         <w:ind w:left="850"/>
       </w:pPr>
       <w:r>
@@ -2106,6 +3028,60 @@
         <w:br/>
         <w:br/>
         <w:t>So your client's property doesn't just appreciate — it pays for itself while they're not there. That's a very compelling story to tell your investor clients."</w:t>
+      </w:r>
+    </w:p>
+    <w:p>
+      <w:pPr>
+        <w:spacing w:before="100" w:after="40"/>
+        <w:ind w:left="567"/>
+      </w:pPr>
+      <w:r>
+        <w:rPr>
+          <w:b/>
+          <w:color w:val="2266AA"/>
+          <w:sz w:val="19"/>
+        </w:rPr>
+        <w:t>🇪🇸  Versión en español:</w:t>
+      </w:r>
+    </w:p>
+    <w:p>
+      <w:pPr>
+        <w:spacing w:before="40" w:after="40"/>
+        <w:ind w:left="567"/>
+      </w:pPr>
+      <w:r>
+        <w:rPr>
+          <w:b/>
+          <w:color w:val="224488"/>
+          <w:sz w:val="20"/>
+        </w:rPr>
+        <w:t>GUIÓN EN ESPAÑOL (Representante de Inmomás Holidays):</w:t>
+      </w:r>
+    </w:p>
+    <w:p>
+      <w:pPr>
+        <w:spacing w:before="40" w:after="160"/>
+        <w:ind w:left="850"/>
+      </w:pPr>
+      <w:r>
+        <w:rPr>
+          <w:i/>
+          <w:color w:val="111144"/>
+          <w:sz w:val="21"/>
+        </w:rPr>
+        <w:t>"Hola a todos, soy [Nombre] de Inmomás Holidays — somos el brazo de gestión de propiedades y alquiler vacacional del grupo RE/MAX Inmomás.</w:t>
+        <w:br/>
+        <w:br/>
+        <w:t>Muchos compradores norteamericanos compran en España no solo como residencia principal, sino como inversión — quieren usar la propiedad 4 o 6 semanas al año y que genere ingresos el resto del tiempo. Eso es exactamente lo que nosotros gestionamos.</w:t>
+        <w:br/>
+        <w:br/>
+        <w:t>Esto es lo que hacemos: tramitamos la licencia de alquiler turístico — que exige la ley española y es bastante compleja de obtener. Publicamos la propiedad en todas las plataformas principales — Airbnb, Booking.com, VRBO. Gestionamos el check-in, la limpieza, el mantenimiento y la comunicación con los huéspedes. Nuestros clientes reciben un informe mensual y una transferencia bancaria, sin mover un dedo.</w:t>
+        <w:br/>
+        <w:br/>
+        <w:t>¿Cuáles son las rentabilidades? En una propiedad bien ubicada en la Costa Blanca, entregamos consistentemente rentabilidades netas de alquiler de entre el 5% y el 8% anual tras nuestra comisión de gestión.</w:t>
+        <w:br/>
+        <w:br/>
+        <w:t>Así que la propiedad de vuestro cliente no solo se revaloriza — se paga sola mientras ellos no están. Eso es una historia muy convincente para contarles a vuestros clientes inversores."</w:t>
       </w:r>
     </w:p>
     <w:p>
@@ -2124,7 +3100,7 @@
     </w:p>
     <w:p>
       <w:pPr>
-        <w:spacing w:before="40" w:after="120"/>
+        <w:spacing w:before="40" w:after="80"/>
         <w:ind w:left="850"/>
       </w:pPr>
       <w:r>
@@ -2133,7 +3109,35 @@
           <w:color w:val="000000"/>
           <w:sz w:val="21"/>
         </w:rPr>
-        <w:t>"Excellent. And now, finally, I want you to understand how we support YOU as the referring partner — specifically with marketing tools that make it incredibly easy to introduce this opportunity to your clients."</w:t>
+        <w:t>"Excellent. Now that you've met our three key partners, let me tell you about the experience that — in our data — closes more deals than any brochure or website ever could."</w:t>
+      </w:r>
+    </w:p>
+    <w:p>
+      <w:pPr>
+        <w:spacing w:before="100" w:after="40"/>
+        <w:ind w:left="567"/>
+      </w:pPr>
+      <w:r>
+        <w:rPr>
+          <w:b/>
+          <w:color w:val="2266AA"/>
+          <w:sz w:val="19"/>
+        </w:rPr>
+        <w:t>🇪🇸  Versión en español:</w:t>
+      </w:r>
+    </w:p>
+    <w:p>
+      <w:pPr>
+        <w:spacing w:before="40" w:after="160"/>
+        <w:ind w:left="850"/>
+      </w:pPr>
+      <w:r>
+        <w:rPr>
+          <w:i/>
+          <w:color w:val="111144"/>
+          <w:sz w:val="21"/>
+        </w:rPr>
+        <w:t>"Excelente. Ahora que ya conocéis a nuestros tres partners clave, dejadme hablaros de la experiencia que — según nuestros datos — cierra más operaciones que cualquier folleto o página web jamás podría conseguir."</w:t>
       </w:r>
     </w:p>
     <w:p>
@@ -2147,78 +3151,7 @@
           <w:color w:val="1A1A2E"/>
           <w:sz w:val="28"/>
         </w:rPr>
-        <w:t>🎬 SLIDE 12: PARTNER DE MARKETING — Smbiotica</w:t>
-      </w:r>
-    </w:p>
-    <w:p>
-      <w:pPr>
-        <w:spacing w:before="60" w:after="60"/>
-        <w:ind w:left="567"/>
-      </w:pPr>
-      <w:r>
-        <w:rPr>
-          <w:i/>
-          <w:color w:val="808080"/>
-          <w:sz w:val="19"/>
-        </w:rPr>
-        <w:t>[Logo de Smbiotica · 2 minutos]</w:t>
-      </w:r>
-    </w:p>
-    <w:p>
-      <w:pPr>
-        <w:spacing w:before="120" w:after="40"/>
-        <w:ind w:left="567"/>
-      </w:pPr>
-      <w:r>
-        <w:rPr>
-          <w:b/>
-          <w:color w:val="444444"/>
-          <w:sz w:val="20"/>
-        </w:rPr>
-        <w:t>GUIÓN (Representante de Smbiotica):</w:t>
-      </w:r>
-    </w:p>
-    <w:p>
-      <w:pPr>
-        <w:spacing w:before="40" w:after="120"/>
-        <w:ind w:left="850"/>
-      </w:pPr>
-      <w:r>
-        <w:rPr>
-          <w:i/>
-          <w:color w:val="000000"/>
-          <w:sz w:val="21"/>
-        </w:rPr>
-        <w:t>"Hello! I'm [Nombre] from Smbiotica — we are the digital strategy and marketing partner for RE/MAX Inmomás International.</w:t>
-        <w:br/>
-        <w:br/>
-        <w:t>Our role is to make sure that you — the referring Realtor — have everything you need to generate interest in Spain without doing any heavy lifting.</w:t>
-        <w:br/>
-        <w:br/>
-        <w:t>What does that look like in practice? We provide you with co-branded landing pages — personalized with your name and photo — that you can share directly with your client database or post on social media. We design bilingual email campaigns in English and Spanish. We produce social media content — reels, graphics, statistics — that you can literally copy and paste into your Instagram or LinkedIn.</w:t>
-        <w:br/>
-        <w:br/>
-        <w:t>We also run targeted advertising campaigns in your local market — in cities like Miami, Los Angeles, Toronto, New York — that generate pre-qualified leads who are already researching Spain. When a lead comes in from your territory, it gets assigned to you.</w:t>
-        <w:br/>
-        <w:br/>
-        <w:t>You don't need to become a Spain expert. You need to make one introduction, and we make you look like one.</w:t>
-        <w:br/>
-        <w:br/>
-        <w:t>That is our commitment to you as a partner."</w:t>
-      </w:r>
-    </w:p>
-    <w:p>
-      <w:pPr>
-        <w:pStyle w:val="Heading2"/>
-        <w:spacing w:before="240" w:after="80"/>
-      </w:pPr>
-      <w:r>
-        <w:rPr>
-          <w:b/>
-          <w:color w:val="1A1A2E"/>
-          <w:sz w:val="28"/>
-        </w:rPr>
-        <w:t>🎬 SLIDE 13: EL VIP PROPERTY TOUR — La Experiencia que Cierra la Venta</w:t>
+        <w:t>🎬 SLIDE 12: EL VIP PROPERTY TOUR — La Experiencia que Cierra la Venta</w:t>
       </w:r>
     </w:p>
     <w:p>
@@ -2246,12 +3179,12 @@
           <w:color w:val="444444"/>
           <w:sz w:val="20"/>
         </w:rPr>
-        <w:t>GUIÓN (Agente 2):</w:t>
+        <w:t>GUIÓN EN INGLÉS (Agente 2):</w:t>
       </w:r>
     </w:p>
     <w:p>
       <w:pPr>
-        <w:spacing w:before="40" w:after="120"/>
+        <w:spacing w:before="40" w:after="80"/>
         <w:ind w:left="850"/>
       </w:pPr>
       <w:r>
@@ -2273,6 +3206,60 @@
         <w:br/>
         <w:br/>
         <w:t>You make the introduction. We do the rest. You earn your 25%."</w:t>
+      </w:r>
+    </w:p>
+    <w:p>
+      <w:pPr>
+        <w:spacing w:before="100" w:after="40"/>
+        <w:ind w:left="567"/>
+      </w:pPr>
+      <w:r>
+        <w:rPr>
+          <w:b/>
+          <w:color w:val="2266AA"/>
+          <w:sz w:val="19"/>
+        </w:rPr>
+        <w:t>🇪🇸  Versión en español:</w:t>
+      </w:r>
+    </w:p>
+    <w:p>
+      <w:pPr>
+        <w:spacing w:before="40" w:after="40"/>
+        <w:ind w:left="567"/>
+      </w:pPr>
+      <w:r>
+        <w:rPr>
+          <w:b/>
+          <w:color w:val="224488"/>
+          <w:sz w:val="20"/>
+        </w:rPr>
+        <w:t>GUIÓN EN ESPAÑOL (Agente 2):</w:t>
+      </w:r>
+    </w:p>
+    <w:p>
+      <w:pPr>
+        <w:spacing w:before="40" w:after="160"/>
+        <w:ind w:left="850"/>
+      </w:pPr>
+      <w:r>
+        <w:rPr>
+          <w:i/>
+          <w:color w:val="111144"/>
+          <w:sz w:val="21"/>
+        </w:rPr>
+        <w:t>"Quiero cerrar esta sección con algo que creo que es la herramienta de ventas más poderosa de todo nuestro programa — y no le cuesta nada adicional a vuestro cliente.</w:t>
+        <w:br/>
+        <w:br/>
+        <w:t>Se llama el VIP Property Tour.</w:t>
+        <w:br/>
+        <w:br/>
+        <w:t>Cuando un cliente tiene un interés serio, le invitamos a España para una visita de 4 a 5 días completamente organizada. Le recogemos en el aeropuerto. Le llevamos a propiedades cuidadosamente seleccionadas. Organizamos reuniones con el equipo legal y el especialista hipotecario. Organizamos cenas donde conoce a otros expats americanos y canadienses que ya viven aquí — personas a quienes puede preguntarles "¿de verdad es tan bueno como suena?" Y la respuesta, absolutamente siempre, es: "Sí. Y ojalá lo hubiera hecho antes."</w:t>
+        <w:br/>
+        <w:br/>
+        <w:t>La tasa de cierre de los clientes que vienen al VIP Tour supera el 70%. Llegan como interesados. Se van como compradores.</w:t>
+        <w:br/>
+        <w:br/>
+        <w:t>Vosotros hacéis la presentación. Nosotros hacemos el resto. Vosotros cobráis vuestro 25%."</w:t>
       </w:r>
     </w:p>
     <w:p>
@@ -2312,7 +3299,7 @@
           <w:color w:val="808080"/>
           <w:sz w:val="20"/>
         </w:rPr>
-        <w:t>⏰ 35:00 – 43:00 | Presentan: Agentes de RE/MAX Inmomás</w:t>
+        <w:t>⏰ 32:00 – 40:00 | Presentan: Agentes de RE/MAX Inmomás</w:t>
       </w:r>
     </w:p>
     <w:p>
@@ -2326,7 +3313,7 @@
           <w:color w:val="1A1A2E"/>
           <w:sz w:val="28"/>
         </w:rPr>
-        <w:t>🎬 SLIDE 14: "The Commission Blueprint" — Tu 25%</w:t>
+        <w:t>🎬 SLIDE 13: "The Commission Blueprint" — Tu 25%</w:t>
       </w:r>
     </w:p>
     <w:p>
@@ -2354,12 +3341,12 @@
           <w:color w:val="444444"/>
           <w:sz w:val="20"/>
         </w:rPr>
-        <w:t>GUIÓN (Agente 1):</w:t>
+        <w:t>GUIÓN EN INGLÉS (Agente 1):</w:t>
       </w:r>
     </w:p>
     <w:p>
       <w:pPr>
-        <w:spacing w:before="40" w:after="120"/>
+        <w:spacing w:before="40" w:after="80"/>
         <w:ind w:left="850"/>
       </w:pPr>
       <w:r>
@@ -2385,6 +3372,60 @@
     </w:p>
     <w:p>
       <w:pPr>
+        <w:spacing w:before="100" w:after="40"/>
+        <w:ind w:left="567"/>
+      </w:pPr>
+      <w:r>
+        <w:rPr>
+          <w:b/>
+          <w:color w:val="2266AA"/>
+          <w:sz w:val="19"/>
+        </w:rPr>
+        <w:t>🇪🇸  Versión en español:</w:t>
+      </w:r>
+    </w:p>
+    <w:p>
+      <w:pPr>
+        <w:spacing w:before="40" w:after="40"/>
+        <w:ind w:left="567"/>
+      </w:pPr>
+      <w:r>
+        <w:rPr>
+          <w:b/>
+          <w:color w:val="224488"/>
+          <w:sz w:val="20"/>
+        </w:rPr>
+        <w:t>GUIÓN EN ESPAÑOL (Agente 1):</w:t>
+      </w:r>
+    </w:p>
+    <w:p>
+      <w:pPr>
+        <w:spacing w:before="40" w:after="160"/>
+        <w:ind w:left="850"/>
+      </w:pPr>
+      <w:r>
+        <w:rPr>
+          <w:i/>
+          <w:color w:val="111144"/>
+          <w:sz w:val="21"/>
+        </w:rPr>
+        <w:t>"Muy bien. Esta es la parte que todo el mundo estaba esperando. Hablemos de dinero.</w:t>
+        <w:br/>
+        <w:br/>
+        <w:t>Así funciona la estructura de comisiones — y voy a ser 100% transparente porque sé que eso es lo que necesitáis como profesionales.</w:t>
+        <w:br/>
+        <w:br/>
+        <w:t>En España, nuestro equipo gestiona el servicio completo del lado del comprador. Cobramos al comprador una tarifa de servicio integral del 5% del precio de compra de la propiedad. Esta tarifa lo cubre todo: búsqueda de propiedad, coordinación legal, asistencia con la financiación, negociación, cierre y soporte postventa.</w:t>
+        <w:br/>
+        <w:br/>
+        <w:t>Como Realtor referente — es decir, vosotros que nos habéis presentado a vuestro cliente — recibís el 25% de esa tarifa total.</w:t>
+        <w:br/>
+        <w:br/>
+        <w:t>Dejadme hacer los cálculos por vosotros."</w:t>
+      </w:r>
+    </w:p>
+    <w:p>
+      <w:pPr>
         <w:pStyle w:val="Heading2"/>
         <w:spacing w:before="240" w:after="80"/>
       </w:pPr>
@@ -2394,7 +3435,7 @@
           <w:color w:val="1A1A2E"/>
           <w:sz w:val="28"/>
         </w:rPr>
-        <w:t>🎬 SLIDE 15: TABLA DE GANANCIAS REALES — "Real Earnings"</w:t>
+        <w:t>🎬 SLIDE 14: TABLA DE GANANCIAS REALES — "Real Earnings"</w:t>
       </w:r>
     </w:p>
     <w:p>
@@ -2422,12 +3463,12 @@
           <w:color w:val="444444"/>
           <w:sz w:val="20"/>
         </w:rPr>
-        <w:t>GUIÓN:</w:t>
+        <w:t>GUIÓN EN INGLÉS:</w:t>
       </w:r>
     </w:p>
     <w:p>
       <w:pPr>
-        <w:spacing w:before="40" w:after="120"/>
+        <w:spacing w:before="40" w:after="80"/>
         <w:ind w:left="850"/>
       </w:pPr>
       <w:r>
@@ -2437,6 +3478,48 @@
           <w:sz w:val="21"/>
         </w:rPr>
         <w:t>"Let's look at three real scenarios:"</w:t>
+      </w:r>
+    </w:p>
+    <w:p>
+      <w:pPr>
+        <w:spacing w:before="100" w:after="40"/>
+        <w:ind w:left="567"/>
+      </w:pPr>
+      <w:r>
+        <w:rPr>
+          <w:b/>
+          <w:color w:val="2266AA"/>
+          <w:sz w:val="19"/>
+        </w:rPr>
+        <w:t>🇪🇸  Versión en español:</w:t>
+      </w:r>
+    </w:p>
+    <w:p>
+      <w:pPr>
+        <w:spacing w:before="40" w:after="40"/>
+        <w:ind w:left="567"/>
+      </w:pPr>
+      <w:r>
+        <w:rPr>
+          <w:b/>
+          <w:color w:val="224488"/>
+          <w:sz w:val="20"/>
+        </w:rPr>
+        <w:t>GUIÓN EN ESPAÑOL:</w:t>
+      </w:r>
+    </w:p>
+    <w:p>
+      <w:pPr>
+        <w:spacing w:before="40" w:after="160"/>
+        <w:ind w:left="850"/>
+      </w:pPr>
+      <w:r>
+        <w:rPr>
+          <w:i/>
+          <w:color w:val="111144"/>
+          <w:sz w:val="21"/>
+        </w:rPr>
+        <w:t>"Veamos tres escenarios reales:"</w:t>
       </w:r>
     </w:p>
     <w:tbl>
@@ -2841,7 +3924,7 @@
     <w:p/>
     <w:p>
       <w:pPr>
-        <w:spacing w:before="40" w:after="120"/>
+        <w:spacing w:before="40" w:after="80"/>
         <w:ind w:left="850"/>
       </w:pPr>
       <w:r>
@@ -2858,6 +3941,37 @@
     </w:p>
     <w:p>
       <w:pPr>
+        <w:spacing w:before="100" w:after="40"/>
+        <w:ind w:left="567"/>
+      </w:pPr>
+      <w:r>
+        <w:rPr>
+          <w:b/>
+          <w:color w:val="2266AA"/>
+          <w:sz w:val="19"/>
+        </w:rPr>
+        <w:t>🇪🇸  Versión en español:</w:t>
+      </w:r>
+    </w:p>
+    <w:p>
+      <w:pPr>
+        <w:spacing w:before="40" w:after="160"/>
+        <w:ind w:left="850"/>
+      </w:pPr>
+      <w:r>
+        <w:rPr>
+          <w:i/>
+          <w:color w:val="111144"/>
+          <w:sz w:val="21"/>
+        </w:rPr>
+        <w:t>"Pensad en esto: ¿cuántas horas dedicáis actualmente para ganar 7.500 dólares en vuestro mercado local? Visitas, open houses, negociaciones, inspecciones, contingencias, tasaciones...</w:t>
+        <w:br/>
+        <w:br/>
+        <w:t>Con nosotros, invertís cinco minutos rellenando el formulario en nuestro portal de partners. Nosotros nos encargamos del resto. Y vosotros cobráis."</w:t>
+      </w:r>
+    </w:p>
+    <w:p>
+      <w:pPr>
         <w:spacing w:before="120" w:after="40"/>
         <w:ind w:left="567"/>
       </w:pPr>
@@ -2867,12 +3981,12 @@
           <w:color w:val="444444"/>
           <w:sz w:val="20"/>
         </w:rPr>
-        <w:t>GUIÓN (continuación — tono cómplice):</w:t>
+        <w:t>GUIÓN EN INGLÉS (continuación — tono cómplice):</w:t>
       </w:r>
     </w:p>
     <w:p>
       <w:pPr>
-        <w:spacing w:before="40" w:after="120"/>
+        <w:spacing w:before="40" w:after="80"/>
         <w:ind w:left="850"/>
       </w:pPr>
       <w:r>
@@ -2889,6 +4003,51 @@
     </w:p>
     <w:p>
       <w:pPr>
+        <w:spacing w:before="100" w:after="40"/>
+        <w:ind w:left="567"/>
+      </w:pPr>
+      <w:r>
+        <w:rPr>
+          <w:b/>
+          <w:color w:val="2266AA"/>
+          <w:sz w:val="19"/>
+        </w:rPr>
+        <w:t>🇪🇸  Versión en español:</w:t>
+      </w:r>
+    </w:p>
+    <w:p>
+      <w:pPr>
+        <w:spacing w:before="40" w:after="40"/>
+        <w:ind w:left="567"/>
+      </w:pPr>
+      <w:r>
+        <w:rPr>
+          <w:b/>
+          <w:color w:val="224488"/>
+          <w:sz w:val="20"/>
+        </w:rPr>
+        <w:t>GUIÓN EN ESPAÑOL (continuación — tono cómplice):</w:t>
+      </w:r>
+    </w:p>
+    <w:p>
+      <w:pPr>
+        <w:spacing w:before="40" w:after="160"/>
+        <w:ind w:left="850"/>
+      </w:pPr>
+      <w:r>
+        <w:rPr>
+          <w:i/>
+          <w:color w:val="111144"/>
+          <w:sz w:val="21"/>
+        </w:rPr>
+        <w:t>"No os estoy sugiriendo que abandonéis vuestro mercado local. En absoluto. No os pedimos que cambiéis nada de vuestro negocio. Lo que SÍ os ofrecemos es una nueva fuente de ingresos paralela que se activa cada vez que uno de vuestros clientes expresa interés en España — lo cual, a juzgar por los mensajes que estáis enviando en el chat ahora mismo, ocurre con más frecuencia de la que creéis.</w:t>
+        <w:br/>
+        <w:br/>
+        <w:t>Esto no es un ingreso extra puntual. Es una mejora de vuestra red de referencias."</w:t>
+      </w:r>
+    </w:p>
+    <w:p>
+      <w:pPr>
         <w:pStyle w:val="Heading2"/>
         <w:spacing w:before="240" w:after="80"/>
       </w:pPr>
@@ -2898,7 +4057,7 @@
           <w:color w:val="1A1A2E"/>
           <w:sz w:val="28"/>
         </w:rPr>
-        <w:t>🎬 SLIDE 16: EL PROCESO — "How Simple Is It?"</w:t>
+        <w:t>🎬 SLIDE 15: EL PROCESO — "How Simple Is It?"</w:t>
       </w:r>
     </w:p>
     <w:p>
@@ -2926,12 +4085,12 @@
           <w:color w:val="444444"/>
           <w:sz w:val="20"/>
         </w:rPr>
-        <w:t>GUIÓN:</w:t>
+        <w:t>GUIÓN EN INGLÉS:</w:t>
       </w:r>
     </w:p>
     <w:p>
       <w:pPr>
-        <w:spacing w:before="40" w:after="120"/>
+        <w:spacing w:before="40" w:after="80"/>
         <w:ind w:left="850"/>
       </w:pPr>
       <w:r>
@@ -2959,6 +4118,66 @@
         <w:br/>
         <w:br/>
         <w:t>You just extended your business to Europe."</w:t>
+      </w:r>
+    </w:p>
+    <w:p>
+      <w:pPr>
+        <w:spacing w:before="100" w:after="40"/>
+        <w:ind w:left="567"/>
+      </w:pPr>
+      <w:r>
+        <w:rPr>
+          <w:b/>
+          <w:color w:val="2266AA"/>
+          <w:sz w:val="19"/>
+        </w:rPr>
+        <w:t>🇪🇸  Versión en español:</w:t>
+      </w:r>
+    </w:p>
+    <w:p>
+      <w:pPr>
+        <w:spacing w:before="40" w:after="40"/>
+        <w:ind w:left="567"/>
+      </w:pPr>
+      <w:r>
+        <w:rPr>
+          <w:b/>
+          <w:color w:val="224488"/>
+          <w:sz w:val="20"/>
+        </w:rPr>
+        <w:t>GUIÓN EN ESPAÑOL:</w:t>
+      </w:r>
+    </w:p>
+    <w:p>
+      <w:pPr>
+        <w:spacing w:before="40" w:after="160"/>
+        <w:ind w:left="850"/>
+      </w:pPr>
+      <w:r>
+        <w:rPr>
+          <w:i/>
+          <w:color w:val="111144"/>
+          <w:sz w:val="21"/>
+        </w:rPr>
+        <w:t>"Este es todo el proceso en cuatro pasos:</w:t>
+        <w:br/>
+        <w:br/>
+        <w:t>Paso uno: vuestro cliente menciona España. Vosotros decís: "Tengo el equipo perfecto para eso. Os pongo en contacto."</w:t>
+        <w:br/>
+        <w:br/>
+        <w:t>Paso dos: entráis en nuestro portal de partners — el registro lleva dos minutos — e introducís la información básica de vuestro cliente.</w:t>
+        <w:br/>
+        <w:br/>
+        <w:t>Paso tres: nosotros nos hacemos cargo por completo. Nuestro equipo bilingüe contacta al cliente en menos de 24 horas. Gestionamos la búsqueda, las visitas, el proceso legal, la hipoteca, todo. Podéis seguir cada paso en tiempo real en vuestro panel de control — como un tablero Kanban para vuestras referencias.</w:t>
+        <w:br/>
+        <w:br/>
+        <w:t>Paso cuatro: la operación cierra. Recibís vuestra comisión de referencia — en vuestra divisa preferida, mediante transferencia internacional, con un acuerdo formal de referencia firmado digitalmente.</w:t>
+        <w:br/>
+        <w:br/>
+        <w:t>Eso es todo. Cuatro pasos. Sin licencias adicionales. Sin horas extra.</w:t>
+        <w:br/>
+        <w:br/>
+        <w:t>Acabáis de extender vuestro negocio a Europa."</w:t>
       </w:r>
     </w:p>
     <w:p>
@@ -2998,7 +4217,7 @@
           <w:color w:val="808080"/>
           <w:sz w:val="20"/>
         </w:rPr>
-        <w:t>⏰ 43:00 – 55:00 | Presentan: Agentes de RE/MAX Inmomás</w:t>
+        <w:t>⏰ 40:00 – 52:00 | Presentan: Agentes de RE/MAX Inmomás</w:t>
       </w:r>
     </w:p>
     <w:p>
@@ -3012,7 +4231,7 @@
           <w:color w:val="1A1A2E"/>
           <w:sz w:val="28"/>
         </w:rPr>
-        <w:t>🎬 SLIDE 17: DEMO EN VIVO DEL PORTAL PARTNER</w:t>
+        <w:t>🎬 SLIDE 16: DEMO EN VIVO DEL PORTAL PARTNER</w:t>
       </w:r>
     </w:p>
     <w:p>
@@ -3040,12 +4259,12 @@
           <w:color w:val="444444"/>
           <w:sz w:val="20"/>
         </w:rPr>
-        <w:t>GUIÓN (Agente 2):</w:t>
+        <w:t>GUIÓN EN INGLÉS (Agente 2):</w:t>
       </w:r>
     </w:p>
     <w:p>
       <w:pPr>
-        <w:spacing w:before="40" w:after="120"/>
+        <w:spacing w:before="40" w:after="80"/>
         <w:ind w:left="850"/>
       </w:pPr>
       <w:r>
@@ -3086,6 +4305,75 @@
     </w:p>
     <w:p>
       <w:pPr>
+        <w:spacing w:before="100" w:after="40"/>
+        <w:ind w:left="567"/>
+      </w:pPr>
+      <w:r>
+        <w:rPr>
+          <w:b/>
+          <w:color w:val="2266AA"/>
+          <w:sz w:val="19"/>
+        </w:rPr>
+        <w:t>🇪🇸  Versión en español:</w:t>
+      </w:r>
+    </w:p>
+    <w:p>
+      <w:pPr>
+        <w:spacing w:before="40" w:after="40"/>
+        <w:ind w:left="567"/>
+      </w:pPr>
+      <w:r>
+        <w:rPr>
+          <w:b/>
+          <w:color w:val="224488"/>
+          <w:sz w:val="20"/>
+        </w:rPr>
+        <w:t>GUIÓN EN ESPAÑOL (Agente 2):</w:t>
+      </w:r>
+    </w:p>
+    <w:p>
+      <w:pPr>
+        <w:spacing w:before="40" w:after="160"/>
+        <w:ind w:left="850"/>
+      </w:pPr>
+      <w:r>
+        <w:rPr>
+          <w:i/>
+          <w:color w:val="111144"/>
+          <w:sz w:val="21"/>
+        </w:rPr>
+        <w:t>"Dejadme mostraros exactamente con qué vais a trabajar. Voy a compartir mi pantalla ahora.</w:t>
+        <w:br/>
+        <w:br/>
+        <w:t>Este es nuestro portal de partners de RE/MAX Inmomás International. [Mostrar pantalla de login / dashboard]</w:t>
+        <w:br/>
+        <w:br/>
+        <w:t>Esto es lo que veis cuando entráis como Realtor partner: vuestro panel personal con todos vuestros clientes referidos, su estado actual en el proceso de compra — si están en la fase de consulta inicial, en la fase de búsqueda de propiedad, en la fase de oferta o ya post-firma — y un canal de comunicación directa con vuestro agente asignado aquí en España.</w:t>
+        <w:br/>
+        <w:br/>
+        <w:t>No necesitáis enviar emails preguntando "¿qué ha pasado con mi cliente?". Podéis verlo vosotros mismos. En tiempo real. Aquí mismo.</w:t>
+        <w:br/>
+        <w:br/>
+        <w:t>En el lado derecho, veréis vuestro rastreador de ganancias — cada referencia, cada comisión pendiente, cada pago procesado.</w:t>
+        <w:br/>
+        <w:br/>
+        <w:t>[Mostrar sección de documentos]</w:t>
+        <w:br/>
+        <w:br/>
+        <w:t>Aquí está vuestro kit de marketing co-branded: vuestro enlace de landing page personalizado, vuestras plantillas de email bilingüe, vuestros gráficos para redes sociales — listos para descargar y compartir en minutos.</w:t>
+        <w:br/>
+        <w:br/>
+        <w:t>[Mostrar sección de acuerdo de referidos]</w:t>
+        <w:br/>
+        <w:br/>
+        <w:t>Y aquí está el acuerdo de referencia — pre-firmado por RE/MAX Inmomás, con espacio para vuestra firma digital. Es un documento legal que os protege a vosotros, protege a vuestro cliente y define vuestra tarifa. Lo tendréis en vuestro correo en menos de 24 horas tras enviar vuestra primera referencia.</w:t>
+        <w:br/>
+        <w:br/>
+        <w:t>Este es un sistema profesional construido para Realtors profesionales."</w:t>
+      </w:r>
+    </w:p>
+    <w:p>
+      <w:pPr>
         <w:pStyle w:val="Heading2"/>
         <w:spacing w:before="240" w:after="80"/>
       </w:pPr>
@@ -3095,7 +4383,7 @@
           <w:color w:val="1A1A2E"/>
           <w:sz w:val="28"/>
         </w:rPr>
-        <w:t>🎬 SLIDE 18: CALL TO ACTION — "Your Next Step"</w:t>
+        <w:t>🎬 SLIDE 17: CALL TO ACTION — "Your Next Step"</w:t>
       </w:r>
     </w:p>
     <w:p>
@@ -3123,12 +4411,12 @@
           <w:color w:val="444444"/>
           <w:sz w:val="20"/>
         </w:rPr>
-        <w:t>GUIÓN (Agente 1 — cierre poderoso):</w:t>
+        <w:t>GUIÓN EN INGLÉS (Agente 1 — cierre poderoso):</w:t>
       </w:r>
     </w:p>
     <w:p>
       <w:pPr>
-        <w:spacing w:before="40" w:after="120"/>
+        <w:spacing w:before="40" w:after="80"/>
         <w:ind w:left="850"/>
       </w:pPr>
       <w:r>
@@ -3168,6 +4456,78 @@
         <w:br/>
         <w:br/>
         <w:t>Thank you so much for being here today. Let's open up for Q&amp;A."</w:t>
+      </w:r>
+    </w:p>
+    <w:p>
+      <w:pPr>
+        <w:spacing w:before="100" w:after="40"/>
+        <w:ind w:left="567"/>
+      </w:pPr>
+      <w:r>
+        <w:rPr>
+          <w:b/>
+          <w:color w:val="2266AA"/>
+          <w:sz w:val="19"/>
+        </w:rPr>
+        <w:t>🇪🇸  Versión en español:</w:t>
+      </w:r>
+    </w:p>
+    <w:p>
+      <w:pPr>
+        <w:spacing w:before="40" w:after="40"/>
+        <w:ind w:left="567"/>
+      </w:pPr>
+      <w:r>
+        <w:rPr>
+          <w:b/>
+          <w:color w:val="224488"/>
+          <w:sz w:val="20"/>
+        </w:rPr>
+        <w:t>GUIÓN EN ESPAÑOL (Agente 1 — cierre poderoso):</w:t>
+      </w:r>
+    </w:p>
+    <w:p>
+      <w:pPr>
+        <w:spacing w:before="40" w:after="160"/>
+        <w:ind w:left="850"/>
+      </w:pPr>
+      <w:r>
+        <w:rPr>
+          <w:i/>
+          <w:color w:val="111144"/>
+          <w:sz w:val="21"/>
+        </w:rPr>
+        <w:t>"Vamos a abrir el turno de preguntas en un momento. Pero primero, dejadme deciros qué nos gustaría que hicierais ahora mismo, antes de cerrar esta pestaña y volver a vuestro día.</w:t>
+        <w:br/>
+        <w:br/>
+        <w:t>Paso uno: escaneád el código QR en vuestra pantalla — o visitad [URL] — y registraos como partners oficiales. Lleva menos de dos minutos. No os cuesta absolutamente nada.</w:t>
+        <w:br/>
+        <w:br/>
+        <w:t>Paso dos: descargad vuestro Kit de Marketing bilingüe. Incluye vuestra landing page co-branded, tres plantillas de email listas para enviar y cinco publicaciones para redes sociales que podéis publicar esta misma semana.</w:t>
+        <w:br/>
+        <w:br/>
+        <w:t>Paso tres: pensad en un cliente — solo uno — que haya mencionado España. Mandadme su nombre en el chat ahora mismo. Sin compromiso. Solo un nombre. Yo personalmente me pondré en contacto con vosotros después del webinario.</w:t>
+        <w:br/>
+        <w:br/>
+        <w:t>Y eso es todo. Eso es todo lo que necesitamos de vosotros para empezar.</w:t>
+        <w:br/>
+        <w:br/>
+        <w:t>[Pausa emocional]</w:t>
+        <w:br/>
+        <w:br/>
+        <w:t>Quiero cerrar con algo personal. Antes de mudarme a España, miraba oportunidades como esta y pensaba: "Suena demasiado bien para ser verdad." Entiendo ese escepticismo. De verdad que lo entiendo.</w:t>
+        <w:br/>
+        <w:br/>
+        <w:t>Pero esto es lo que sé ahora y que no sabía entonces: el mercado expat norteamericano en España no es un nicho. No es una tendencia. Es un movimiento generacional — millones de personas redefiniendo lo que significa calidad de vida, y eligiendo España para vivirla.</w:t>
+        <w:br/>
+        <w:br/>
+        <w:t>Tenéis clientes que forman parte de ese movimiento. Nosotros tenemos la plataforma, el equipo y la trayectoria para servirles al más alto nivel.</w:t>
+        <w:br/>
+        <w:br/>
+        <w:t>Juntos, ganamos.</w:t>
+        <w:br/>
+        <w:br/>
+        <w:t>Muchísimas gracias por estar aquí hoy. Abrimos el turno de Q&amp;A."</w:t>
       </w:r>
     </w:p>
     <w:p>
@@ -3207,7 +4567,7 @@
           <w:color w:val="808080"/>
           <w:sz w:val="20"/>
         </w:rPr>
-        <w:t>⏰ 48:00 – 55:00</w:t>
+        <w:t>⏰ 46:00 – 52:00</w:t>
       </w:r>
     </w:p>
     <w:p>
@@ -3220,7 +4580,7 @@
           <w:color w:val="C8102E"/>
           <w:sz w:val="22"/>
         </w:rPr>
-        <w:t xml:space="preserve">Pregunta frecuente 1:  </w:t>
+        <w:t xml:space="preserve">Q1 (EN):  </w:t>
       </w:r>
       <w:r>
         <w:rPr>
@@ -3233,7 +4593,7 @@
     </w:p>
     <w:p>
       <w:pPr>
-        <w:spacing w:before="60" w:after="120"/>
+        <w:spacing w:before="40" w:after="60"/>
         <w:ind w:left="567"/>
       </w:pPr>
       <w:r>
@@ -3242,7 +4602,7 @@
           <w:color w:val="333333"/>
           <w:sz w:val="21"/>
         </w:rPr>
-        <w:t xml:space="preserve">Respuesta: </w:t>
+        <w:t xml:space="preserve">Answer: </w:t>
       </w:r>
       <w:r>
         <w:rPr>
@@ -3255,6 +4615,49 @@
     </w:p>
     <w:p>
       <w:pPr>
+        <w:spacing w:before="80" w:after="60"/>
+      </w:pPr>
+      <w:r>
+        <w:rPr>
+          <w:b/>
+          <w:color w:val="2266AA"/>
+          <w:sz w:val="22"/>
+        </w:rPr>
+        <w:t xml:space="preserve">P1 (ES):  </w:t>
+      </w:r>
+      <w:r>
+        <w:rPr>
+          <w:i/>
+          <w:color w:val="111166"/>
+          <w:sz w:val="22"/>
+        </w:rPr>
+        <w:t>"¿Cómo paga mi cliente si compra en euros?"</w:t>
+      </w:r>
+    </w:p>
+    <w:p>
+      <w:pPr>
+        <w:spacing w:before="40" w:after="160"/>
+        <w:ind w:left="567"/>
+      </w:pPr>
+      <w:r>
+        <w:rPr>
+          <w:b/>
+          <w:color w:val="222244"/>
+          <w:sz w:val="21"/>
+        </w:rPr>
+        <w:t xml:space="preserve">Respuesta: </w:t>
+      </w:r>
+      <w:r>
+        <w:rPr>
+          <w:i/>
+          <w:color w:val="111144"/>
+          <w:sz w:val="21"/>
+        </w:rPr>
+        <w:t>"Excelente pregunta. Todas las transacciones se realizan en euros — eso es estándar en el mercado inmobiliario español. La mayoría de nuestros clientes norteamericanos utilizan especialistas en cambio de divisas como Wise o OFX para transferir fondos a tipos competitivos. UCI, nuestro partner hipotecario, también da soporte a contribuyentes de EE.UU. y Canadá con financiación denominada en euros. Les orientamos en todo el proceso — vuestro cliente no tendrá que resolverlo solo."</w:t>
+      </w:r>
+    </w:p>
+    <w:p>
+      <w:pPr>
         <w:spacing w:before="200" w:after="60"/>
       </w:pPr>
       <w:r>
@@ -3263,7 +4666,7 @@
           <w:color w:val="C8102E"/>
           <w:sz w:val="22"/>
         </w:rPr>
-        <w:t xml:space="preserve">Pregunta frecuente 2:  </w:t>
+        <w:t xml:space="preserve">Q2 (EN):  </w:t>
       </w:r>
       <w:r>
         <w:rPr>
@@ -3276,7 +4679,7 @@
     </w:p>
     <w:p>
       <w:pPr>
-        <w:spacing w:before="60" w:after="120"/>
+        <w:spacing w:before="40" w:after="60"/>
         <w:ind w:left="567"/>
       </w:pPr>
       <w:r>
@@ -3285,7 +4688,7 @@
           <w:color w:val="333333"/>
           <w:sz w:val="21"/>
         </w:rPr>
-        <w:t xml:space="preserve">Respuesta: </w:t>
+        <w:t xml:space="preserve">Answer: </w:t>
       </w:r>
       <w:r>
         <w:rPr>
@@ -3298,6 +4701,49 @@
     </w:p>
     <w:p>
       <w:pPr>
+        <w:spacing w:before="80" w:after="60"/>
+      </w:pPr>
+      <w:r>
+        <w:rPr>
+          <w:b/>
+          <w:color w:val="2266AA"/>
+          <w:sz w:val="22"/>
+        </w:rPr>
+        <w:t xml:space="preserve">P2 (ES):  </w:t>
+      </w:r>
+      <w:r>
+        <w:rPr>
+          <w:i/>
+          <w:color w:val="111166"/>
+          <w:sz w:val="22"/>
+        </w:rPr>
+        <w:t>"¿Necesito licencia en España para recibir una comisión de referencia?"</w:t>
+      </w:r>
+    </w:p>
+    <w:p>
+      <w:pPr>
+        <w:spacing w:before="40" w:after="160"/>
+        <w:ind w:left="567"/>
+      </w:pPr>
+      <w:r>
+        <w:rPr>
+          <w:b/>
+          <w:color w:val="222244"/>
+          <w:sz w:val="21"/>
+        </w:rPr>
+        <w:t xml:space="preserve">Respuesta: </w:t>
+      </w:r>
+      <w:r>
+        <w:rPr>
+          <w:i/>
+          <w:color w:val="111144"/>
+          <w:sz w:val="21"/>
+        </w:rPr>
+        <w:t>"No. En España, el sistema de agencias inmobiliarias no requiere la misma estructura de licencias que la NAR en EE.UU. o la CREA en Canadá. La comisión de referencia se os abona como una tarifa de servicio B2B bajo un acuerdo de referencia — no como un reparto de comisión. Os recomendamos verificar con vuestro broker que esto está permitido bajo la política de vuestra agencia, lo cual en la gran mayoría de casos es así para referencias internacionales. Nuestro equipo legal puede proporcionar documentación de soporte si la necesitáis."</w:t>
+      </w:r>
+    </w:p>
+    <w:p>
+      <w:pPr>
         <w:spacing w:before="200" w:after="60"/>
       </w:pPr>
       <w:r>
@@ -3306,7 +4752,7 @@
           <w:color w:val="C8102E"/>
           <w:sz w:val="22"/>
         </w:rPr>
-        <w:t xml:space="preserve">Pregunta frecuente 3:  </w:t>
+        <w:t xml:space="preserve">Q3 (EN):  </w:t>
       </w:r>
       <w:r>
         <w:rPr>
@@ -3319,7 +4765,7 @@
     </w:p>
     <w:p>
       <w:pPr>
-        <w:spacing w:before="60" w:after="120"/>
+        <w:spacing w:before="40" w:after="60"/>
         <w:ind w:left="567"/>
       </w:pPr>
       <w:r>
@@ -3328,7 +4774,7 @@
           <w:color w:val="333333"/>
           <w:sz w:val="21"/>
         </w:rPr>
-        <w:t xml:space="preserve">Respuesta: </w:t>
+        <w:t xml:space="preserve">Answer: </w:t>
       </w:r>
       <w:r>
         <w:rPr>
@@ -3341,6 +4787,49 @@
     </w:p>
     <w:p>
       <w:pPr>
+        <w:spacing w:before="80" w:after="60"/>
+      </w:pPr>
+      <w:r>
+        <w:rPr>
+          <w:b/>
+          <w:color w:val="2266AA"/>
+          <w:sz w:val="22"/>
+        </w:rPr>
+        <w:t xml:space="preserve">P3 (ES):  </w:t>
+      </w:r>
+      <w:r>
+        <w:rPr>
+          <w:i/>
+          <w:color w:val="111166"/>
+          <w:sz w:val="22"/>
+        </w:rPr>
+        <w:t>"¿Y si mi cliente decide no comprar? ¿Cobro igualmente?"</w:t>
+      </w:r>
+    </w:p>
+    <w:p>
+      <w:pPr>
+        <w:spacing w:before="40" w:after="160"/>
+        <w:ind w:left="567"/>
+      </w:pPr>
+      <w:r>
+        <w:rPr>
+          <w:b/>
+          <w:color w:val="222244"/>
+          <w:sz w:val="21"/>
+        </w:rPr>
+        <w:t xml:space="preserve">Respuesta: </w:t>
+      </w:r>
+      <w:r>
+        <w:rPr>
+          <w:i/>
+          <w:color w:val="111144"/>
+          <w:sz w:val="21"/>
+        </w:rPr>
+        <w:t>"La comisión de referencia se paga al cierre exitoso de la operación. Si el cliente decide no comprar, no hay ningún cargo — ni de nuestra parte ni de la vuestra. No hay costes iniciales, ni honorarios de retención, ni ningún riesgo para vosotros. Vosotros invertís cero. Si se cierra, cobráis. Así de sencillo es el acuerdo."</w:t>
+      </w:r>
+    </w:p>
+    <w:p>
+      <w:pPr>
         <w:spacing w:before="200" w:after="60"/>
       </w:pPr>
       <w:r>
@@ -3349,7 +4838,7 @@
           <w:color w:val="C8102E"/>
           <w:sz w:val="22"/>
         </w:rPr>
-        <w:t xml:space="preserve">Pregunta frecuente 4:  </w:t>
+        <w:t xml:space="preserve">Q4 (EN):  </w:t>
       </w:r>
       <w:r>
         <w:rPr>
@@ -3362,7 +4851,7 @@
     </w:p>
     <w:p>
       <w:pPr>
-        <w:spacing w:before="60" w:after="120"/>
+        <w:spacing w:before="40" w:after="60"/>
         <w:ind w:left="567"/>
       </w:pPr>
       <w:r>
@@ -3371,7 +4860,7 @@
           <w:color w:val="333333"/>
           <w:sz w:val="21"/>
         </w:rPr>
-        <w:t xml:space="preserve">Respuesta: </w:t>
+        <w:t xml:space="preserve">Answer: </w:t>
       </w:r>
       <w:r>
         <w:rPr>
@@ -3384,6 +4873,49 @@
     </w:p>
     <w:p>
       <w:pPr>
+        <w:spacing w:before="80" w:after="60"/>
+      </w:pPr>
+      <w:r>
+        <w:rPr>
+          <w:b/>
+          <w:color w:val="2266AA"/>
+          <w:sz w:val="22"/>
+        </w:rPr>
+        <w:t xml:space="preserve">P4 (ES):  </w:t>
+      </w:r>
+      <w:r>
+        <w:rPr>
+          <w:i/>
+          <w:color w:val="111166"/>
+          <w:sz w:val="22"/>
+        </w:rPr>
+        <w:t>"¿Cómo sé que mi cliente está protegido legalmente?"</w:t>
+      </w:r>
+    </w:p>
+    <w:p>
+      <w:pPr>
+        <w:spacing w:before="40" w:after="160"/>
+        <w:ind w:left="567"/>
+      </w:pPr>
+      <w:r>
+        <w:rPr>
+          <w:b/>
+          <w:color w:val="222244"/>
+          <w:sz w:val="21"/>
+        </w:rPr>
+        <w:t xml:space="preserve">Respuesta: </w:t>
+      </w:r>
+      <w:r>
+        <w:rPr>
+          <w:i/>
+          <w:color w:val="111144"/>
+          <w:sz w:val="21"/>
+        </w:rPr>
+        <w:t>"Nuestro partner legal — Fuster &amp; Associates — lleva más de [X] años protegiendo a compradores internacionales en España. Realizan una diligencia debida completa sobre cada propiedad: verificación del título, comprobación urbanística, deudas pendientes, cumplimiento de toda la normativa local. Cada compraventa pasa por un notario independiente. Vuestro cliente está protegido en cada paso, y podéis comunicaros directamente con el equipo legal en inglés."</w:t>
+      </w:r>
+    </w:p>
+    <w:p>
+      <w:pPr>
         <w:spacing w:before="200" w:after="60"/>
       </w:pPr>
       <w:r>
@@ -3392,7 +4924,7 @@
           <w:color w:val="C8102E"/>
           <w:sz w:val="22"/>
         </w:rPr>
-        <w:t xml:space="preserve">Pregunta frecuente 5:  </w:t>
+        <w:t xml:space="preserve">Q5 (EN):  </w:t>
       </w:r>
       <w:r>
         <w:rPr>
@@ -3405,7 +4937,7 @@
     </w:p>
     <w:p>
       <w:pPr>
-        <w:spacing w:before="60" w:after="120"/>
+        <w:spacing w:before="40" w:after="60"/>
         <w:ind w:left="567"/>
       </w:pPr>
       <w:r>
@@ -3414,7 +4946,7 @@
           <w:color w:val="333333"/>
           <w:sz w:val="21"/>
         </w:rPr>
-        <w:t xml:space="preserve">Respuesta: </w:t>
+        <w:t xml:space="preserve">Answer: </w:t>
       </w:r>
       <w:r>
         <w:rPr>
@@ -3427,6 +4959,49 @@
     </w:p>
     <w:p>
       <w:pPr>
+        <w:spacing w:before="80" w:after="60"/>
+      </w:pPr>
+      <w:r>
+        <w:rPr>
+          <w:b/>
+          <w:color w:val="2266AA"/>
+          <w:sz w:val="22"/>
+        </w:rPr>
+        <w:t xml:space="preserve">P5 (ES):  </w:t>
+      </w:r>
+      <w:r>
+        <w:rPr>
+          <w:i/>
+          <w:color w:val="111166"/>
+          <w:sz w:val="22"/>
+        </w:rPr>
+        <w:t>"¿Qué impuestos paga habitualmente un comprador en España?"</w:t>
+      </w:r>
+    </w:p>
+    <w:p>
+      <w:pPr>
+        <w:spacing w:before="40" w:after="160"/>
+        <w:ind w:left="567"/>
+      </w:pPr>
+      <w:r>
+        <w:rPr>
+          <w:b/>
+          <w:color w:val="222244"/>
+          <w:sz w:val="21"/>
+        </w:rPr>
+        <w:t xml:space="preserve">Respuesta: </w:t>
+      </w:r>
+      <w:r>
+        <w:rPr>
+          <w:i/>
+          <w:color w:val="111144"/>
+          <w:sz w:val="21"/>
+        </w:rPr>
+        <w:t>"Para propiedades de segunda mano, los compradores pagan un impuesto de transmisiones patrimoniales — llamado ITP — que varía según la región, generalmente entre el 8% y el 10% del precio de compra. Para obra nueva, es el IVA al 10% más el 1,5% de actos jurídicos documentados. Estos impuestos están incluidos en cada presupuesto que facilitamos a los clientes desde el primer día — sin sorpresas. El equipo de Fuster proporciona un desglose completo de costes antes de realizar cualquier oferta."</w:t>
+      </w:r>
+    </w:p>
+    <w:p>
+      <w:pPr>
         <w:spacing w:before="200" w:after="60"/>
       </w:pPr>
       <w:r>
@@ -3435,7 +5010,7 @@
           <w:color w:val="C8102E"/>
           <w:sz w:val="22"/>
         </w:rPr>
-        <w:t xml:space="preserve">Pregunta frecuente 6:  </w:t>
+        <w:t xml:space="preserve">Q6 (EN):  </w:t>
       </w:r>
       <w:r>
         <w:rPr>
@@ -3448,7 +5023,7 @@
     </w:p>
     <w:p>
       <w:pPr>
-        <w:spacing w:before="60" w:after="120"/>
+        <w:spacing w:before="40" w:after="60"/>
         <w:ind w:left="567"/>
       </w:pPr>
       <w:r>
@@ -3457,7 +5032,7 @@
           <w:color w:val="333333"/>
           <w:sz w:val="21"/>
         </w:rPr>
-        <w:t xml:space="preserve">Respuesta: </w:t>
+        <w:t xml:space="preserve">Answer: </w:t>
       </w:r>
       <w:r>
         <w:rPr>
@@ -3470,6 +5045,49 @@
     </w:p>
     <w:p>
       <w:pPr>
+        <w:spacing w:before="80" w:after="60"/>
+      </w:pPr>
+      <w:r>
+        <w:rPr>
+          <w:b/>
+          <w:color w:val="2266AA"/>
+          <w:sz w:val="22"/>
+        </w:rPr>
+        <w:t xml:space="preserve">P6 (ES):  </w:t>
+      </w:r>
+      <w:r>
+        <w:rPr>
+          <w:i/>
+          <w:color w:val="111166"/>
+          <w:sz w:val="22"/>
+        </w:rPr>
+        <w:t>"¿Los clientes canadienses también pueden obtener la Golden Visa?"</w:t>
+      </w:r>
+    </w:p>
+    <w:p>
+      <w:pPr>
+        <w:spacing w:before="40" w:after="160"/>
+        <w:ind w:left="567"/>
+      </w:pPr>
+      <w:r>
+        <w:rPr>
+          <w:b/>
+          <w:color w:val="222244"/>
+          <w:sz w:val="21"/>
+        </w:rPr>
+        <w:t xml:space="preserve">Respuesta: </w:t>
+      </w:r>
+      <w:r>
+        <w:rPr>
+          <w:i/>
+          <w:color w:val="111144"/>
+          <w:sz w:val="21"/>
+        </w:rPr>
+        <w:t>"Por supuesto. El programa de Golden Visa está disponible para ciudadanos no comunitarios independientemente de su nacionalidad — americanos, canadienses y otros. Una inversión inmobiliaria mínima de 500.000 euros abre la puerta a la residencia completa para toda la familia, incluyendo cónyuge e hijos dependientes. El tiempo de tramitación actual es de 3 a 6 meses. Fuster &amp; Associates gestiona íntegramente la solicitud."</w:t>
+      </w:r>
+    </w:p>
+    <w:p>
+      <w:pPr>
         <w:spacing w:before="80" w:after="80"/>
       </w:pPr>
       <w:r>
@@ -3505,12 +5123,12 @@
           <w:color w:val="444444"/>
           <w:sz w:val="20"/>
         </w:rPr>
-        <w:t>GUIÓN (Agente 1 — cierre final):</w:t>
+        <w:t>GUIÓN EN INGLÉS (Agente 1 — cierre final):</w:t>
       </w:r>
     </w:p>
     <w:p>
       <w:pPr>
-        <w:spacing w:before="40" w:after="120"/>
+        <w:spacing w:before="40" w:after="80"/>
         <w:ind w:left="850"/>
       </w:pPr>
       <w:r>
@@ -3532,6 +5150,60 @@
         <w:br/>
         <w:br/>
         <w:t>Have a wonderful day, wherever you are. Bienvenidos al equipo. Welcome to the team."</w:t>
+      </w:r>
+    </w:p>
+    <w:p>
+      <w:pPr>
+        <w:spacing w:before="100" w:after="40"/>
+        <w:ind w:left="567"/>
+      </w:pPr>
+      <w:r>
+        <w:rPr>
+          <w:b/>
+          <w:color w:val="2266AA"/>
+          <w:sz w:val="19"/>
+        </w:rPr>
+        <w:t>🇪🇸  Versión en español:</w:t>
+      </w:r>
+    </w:p>
+    <w:p>
+      <w:pPr>
+        <w:spacing w:before="40" w:after="40"/>
+        <w:ind w:left="567"/>
+      </w:pPr>
+      <w:r>
+        <w:rPr>
+          <w:b/>
+          <w:color w:val="224488"/>
+          <w:sz w:val="20"/>
+        </w:rPr>
+        <w:t>GUIÓN EN ESPAÑOL (Agente 1 — cierre final):</w:t>
+      </w:r>
+    </w:p>
+    <w:p>
+      <w:pPr>
+        <w:spacing w:before="40" w:after="160"/>
+        <w:ind w:left="850"/>
+      </w:pPr>
+      <w:r>
+        <w:rPr>
+          <w:i/>
+          <w:color w:val="111144"/>
+          <w:sz w:val="21"/>
+        </w:rPr>
+        <w:t>"Muchísimas gracias a todos por vuestras increíbles preguntas y por la energía de hoy. Son conversaciones como estas las que me recuerdan por qué amo este negocio.</w:t>
+        <w:br/>
+        <w:br/>
+        <w:t>La grabación de la sesión de hoy os llegará por email en menos de 24 horas. Compartidla con colegas que no hayan podido asistir — esta oportunidad está abierta a cada Realtor de vuestra red.</w:t>
+        <w:br/>
+        <w:br/>
+        <w:t>No lo olvidéis: escaneád el código QR, registraos en el portal, descargad vuestro Kit de Marketing. Vuestra primera referencia puede estar más cerca de lo que creéis.</w:t>
+        <w:br/>
+        <w:br/>
+        <w:t>Y por favor — contactadnos directamente. Nuestro WhatsApp está en pantalla. Nuestro email está en pantalla. Somos personas reales, en una oficina real, en un país extraordinariamente bello — y tenemos genuinas ganas de trabajar con vosotros.</w:t>
+        <w:br/>
+        <w:br/>
+        <w:t>Que tengáis un día maravilloso, dondequiera que estéis. Bienvenidos al equipo. Welcome to the team."</w:t>
       </w:r>
     </w:p>
     <w:p>
@@ -3649,7 +5321,7 @@
           <w:color w:val="808080"/>
           <w:sz w:val="18"/>
         </w:rPr>
-        <w:t>Versión 2.0 — Guión completo con diálogo detallado</w:t>
+        <w:t>Versión 2.2 — Guión bilingüe completo EN / ES · Sin partner Smbiotica</w:t>
       </w:r>
     </w:p>
     <w:sectPr>

</xml_diff>